<commit_message>
docs: update BCDXCV templates for tiêu dùng nông nghiệp và kinh doanh — add PA_TRANO table + HĐTD income placeholders
</commit_message>
<xml_diff>
--- a/report_assets/KHCN templates/Báo cáo đề xuất/2268.02A BCDXCV tieu dung kinh doanh.docx
+++ b/report_assets/KHCN templates/Báo cáo đề xuất/2268.02A BCDXCV tieu dung kinh doanh.docx
@@ -105,7 +105,7 @@
                 </mc:Choice>
                 <mc:Fallback>
                   <w:pict>
-                    <v:line w14:anchorId="2558442D" id="Straight Connector 1" o:spid="_x0000_s1026" style="position:absolute;z-index:251662336;visibility:visible;mso-wrap-style:square;mso-wrap-distance-left:9pt;mso-wrap-distance-top:0;mso-wrap-distance-right:9pt;mso-wrap-distance-bottom:0;mso-position-horizontal:center;mso-position-horizontal-relative:margin;mso-position-vertical:absolute;mso-position-vertical-relative:text" from="0,16.5pt" to="108pt,16.5pt" o:gfxdata="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">
+                    <v:line w14:anchorId="0900340B" id="Straight Connector 1" o:spid="_x0000_s1026" style="position:absolute;z-index:251662336;visibility:visible;mso-wrap-style:square;mso-wrap-distance-left:9pt;mso-wrap-distance-top:0;mso-wrap-distance-right:9pt;mso-wrap-distance-bottom:0;mso-position-horizontal:center;mso-position-horizontal-relative:margin;mso-position-vertical:absolute;mso-position-vertical-relative:text" from="0,16.5pt" to="108pt,16.5pt" o:gfxdata="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">
                       <w10:wrap anchorx="margin"/>
                     </v:line>
                   </w:pict>
@@ -257,7 +257,7 @@
                 </mc:Choice>
                 <mc:Fallback>
                   <w:pict>
-                    <v:shapetype w14:anchorId="3F97BAB4" id="_x0000_t32" coordsize="21600,21600" o:spt="32" o:oned="t" path="m,l21600,21600e" filled="f">
+                    <v:shapetype w14:anchorId="2A48ACC9" id="_x0000_t32" coordsize="21600,21600" o:spt="32" o:oned="t" path="m,l21600,21600e" filled="f">
                       <v:path arrowok="t" fillok="f" o:connecttype="none"/>
                       <o:lock v:ext="edit" shapetype="t"/>
                     </v:shapetype>
@@ -9424,297 +9424,2129 @@
     </w:p>
     <w:p>
       <w:pPr>
-        <w:spacing w:after="0" w:line="276" w:lineRule="auto"/>
-        <w:ind w:firstLine="567"/>
-        <w:jc w:val="both"/>
-        <w:rPr>
-          <w:rFonts w:ascii="Times New Roman" w:hAnsi="Times New Roman" w:cs="Times New Roman"/>
-          <w:b/>
+        <w:pStyle w:val="ListParagraph"/>
+        <w:spacing w:after="0" w:line="276" w:lineRule="auto"/>
+        <w:ind w:left="0" w:firstLine="567"/>
+        <w:jc w:val="both"/>
+        <w:rPr>
+          <w:rFonts w:ascii="Times New Roman" w:eastAsia="Times New Roman" w:hAnsi="Times New Roman" w:cs="Times New Roman"/>
+          <w:sz w:val="26"/>
+          <w:szCs w:val="28"/>
+          <w:lang w:val="de-DE"/>
+        </w:rPr>
+      </w:pPr>
+      <w:r>
+        <w:rPr>
+          <w:rFonts w:ascii="Times New Roman" w:eastAsia="Times New Roman" w:hAnsi="Times New Roman" w:cs="Times New Roman"/>
+          <w:sz w:val="26"/>
+          <w:szCs w:val="28"/>
+          <w:lang w:val="de-DE"/>
+        </w:rPr>
+        <w:t>4.1. Khả năng trả nợ của khách hàng:</w:t>
+      </w:r>
+    </w:p>
+    <w:p>
+      <w:pPr>
+        <w:pStyle w:val="ListParagraph"/>
+        <w:spacing w:after="0" w:line="276" w:lineRule="auto"/>
+        <w:ind w:left="0" w:firstLine="567"/>
+        <w:jc w:val="both"/>
+        <w:rPr>
+          <w:rFonts w:ascii="Times New Roman" w:eastAsia="Times New Roman" w:hAnsi="Times New Roman" w:cs="Times New Roman"/>
+          <w:sz w:val="26"/>
+          <w:szCs w:val="28"/>
+          <w:lang w:val="de-DE"/>
+        </w:rPr>
+      </w:pPr>
+      <w:r>
+        <w:rPr>
+          <w:rFonts w:ascii="Times New Roman" w:eastAsia="Times New Roman" w:hAnsi="Times New Roman" w:cs="Times New Roman"/>
+          <w:sz w:val="26"/>
+          <w:szCs w:val="28"/>
+          <w:lang w:val="de-DE"/>
+        </w:rPr>
+        <w:t>a) Thu nhập để trả nợ:</w:t>
+      </w:r>
+      <w:r>
+        <w:rPr>
+          <w:rFonts w:ascii="Times New Roman" w:eastAsia="Times New Roman" w:hAnsi="Times New Roman" w:cs="Times New Roman"/>
+          <w:sz w:val="26"/>
+          <w:szCs w:val="28"/>
+          <w:lang w:val="de-DE"/>
+        </w:rPr>
+        <w:t xml:space="preserve"> </w:t>
+      </w:r>
+      <w:r>
+        <w:rPr>
+          <w:rFonts w:ascii="Times New Roman" w:eastAsia="Times New Roman" w:hAnsi="Times New Roman" w:cs="Times New Roman"/>
+          <w:sz w:val="26"/>
+          <w:szCs w:val="28"/>
+          <w:lang w:val="de-DE"/>
+        </w:rPr>
+        <w:t>[HĐTD.Mô tả nguồn trả nợ].</w:t>
+      </w:r>
+    </w:p>
+    <w:p>
+      <w:pPr>
+        <w:pStyle w:val="ListParagraph"/>
+        <w:spacing w:after="0" w:line="276" w:lineRule="auto"/>
+        <w:ind w:left="0" w:firstLine="567"/>
+        <w:jc w:val="both"/>
+        <w:rPr>
+          <w:rFonts w:ascii="Times New Roman" w:eastAsia="Times New Roman" w:hAnsi="Times New Roman" w:cs="Times New Roman"/>
+          <w:sz w:val="26"/>
+          <w:szCs w:val="28"/>
+          <w:lang w:val="de-DE"/>
+        </w:rPr>
+      </w:pPr>
+      <w:r>
+        <w:rPr>
+          <w:rFonts w:ascii="Times New Roman" w:eastAsia="Times New Roman" w:hAnsi="Times New Roman" w:cs="Times New Roman"/>
+          <w:sz w:val="26"/>
+          <w:szCs w:val="28"/>
+          <w:lang w:val="de-DE"/>
+        </w:rPr>
+        <w:t xml:space="preserve">- </w:t>
+      </w:r>
+      <w:r>
+        <w:rPr>
+          <w:rFonts w:ascii="Times New Roman" w:eastAsia="Times New Roman" w:hAnsi="Times New Roman" w:cs="Times New Roman"/>
+          <w:sz w:val="26"/>
+          <w:szCs w:val="28"/>
+          <w:lang w:val="de-DE"/>
+        </w:rPr>
+        <w:t>Nguồn trả nợ (lợi nhuận bình quân năm): [HĐTD.Nguồn trả nợ] đồng</w:t>
+      </w:r>
+      <w:r>
+        <w:rPr>
+          <w:rFonts w:ascii="Times New Roman" w:eastAsia="Times New Roman" w:hAnsi="Times New Roman" w:cs="Times New Roman"/>
+          <w:sz w:val="26"/>
+          <w:szCs w:val="28"/>
+          <w:lang w:val="de-DE"/>
+        </w:rPr>
+        <w:t>. Cụ thể:</w:t>
+      </w:r>
+    </w:p>
+    <w:p>
+      <w:pPr>
+        <w:pStyle w:val="ListParagraph"/>
+        <w:spacing w:after="0" w:line="276" w:lineRule="auto"/>
+        <w:ind w:left="0" w:firstLine="567"/>
+        <w:contextualSpacing w:val="0"/>
+        <w:jc w:val="right"/>
+        <w:rPr>
+          <w:rFonts w:ascii="Times New Roman" w:eastAsia="Times New Roman" w:hAnsi="Times New Roman" w:cs="Times New Roman"/>
+          <w:sz w:val="26"/>
+          <w:szCs w:val="28"/>
+          <w:lang w:val="de-DE"/>
+        </w:rPr>
+      </w:pPr>
+      <w:r>
+        <w:rPr>
+          <w:rFonts w:ascii="Times New Roman" w:eastAsia="Times New Roman" w:hAnsi="Times New Roman" w:cs="Times New Roman"/>
+          <w:sz w:val="26"/>
+          <w:szCs w:val="28"/>
+          <w:lang w:val="de-DE"/>
+        </w:rPr>
+        <w:t>Đơn vị: đồng</w:t>
+      </w:r>
+    </w:p>
+    <w:tbl>
+      <w:tblPr>
+        <w:tblW w:w="5000" w:type="pct"/>
+        <w:tblLayout w:type="fixed"/>
+        <w:tblLook w:val="04A0" w:firstRow="1" w:lastRow="0" w:firstColumn="1" w:lastColumn="0" w:noHBand="0" w:noVBand="1"/>
+      </w:tblPr>
+      <w:tblGrid>
+        <w:gridCol w:w="961"/>
+        <w:gridCol w:w="2693"/>
+        <w:gridCol w:w="991"/>
+        <w:gridCol w:w="1476"/>
+        <w:gridCol w:w="1500"/>
+        <w:gridCol w:w="2233"/>
+      </w:tblGrid>
+      <w:tr>
+        <w:trPr>
+          <w:trHeight w:val="363"/>
+        </w:trPr>
+        <w:tc>
+          <w:tcPr>
+            <w:tcW w:w="487" w:type="pct"/>
+            <w:tcBorders>
+              <w:top w:val="single" w:sz="4" w:space="0" w:color="auto"/>
+              <w:left w:val="single" w:sz="4" w:space="0" w:color="auto"/>
+              <w:bottom w:val="single" w:sz="4" w:space="0" w:color="auto"/>
+              <w:right w:val="single" w:sz="4" w:space="0" w:color="auto"/>
+            </w:tcBorders>
+            <w:shd w:val="clear" w:color="000000" w:fill="FFFFFF"/>
+            <w:vAlign w:val="center"/>
+            <w:hideMark/>
+          </w:tcPr>
+          <w:p>
+            <w:pPr>
+              <w:spacing w:after="0" w:line="240" w:lineRule="auto"/>
+              <w:jc w:val="center"/>
+              <w:rPr>
+                <w:rFonts w:ascii="Times New Roman" w:eastAsia="Times New Roman" w:hAnsi="Times New Roman" w:cs="Times New Roman"/>
+                <w:b/>
+                <w:bCs/>
+                <w:sz w:val="24"/>
+                <w:szCs w:val="24"/>
+              </w:rPr>
+            </w:pPr>
+            <w:r>
+              <w:rPr>
+                <w:rFonts w:ascii="Times New Roman" w:eastAsia="Times New Roman" w:hAnsi="Times New Roman" w:cs="Times New Roman"/>
+                <w:b/>
+                <w:bCs/>
+                <w:sz w:val="24"/>
+                <w:szCs w:val="24"/>
+              </w:rPr>
+              <w:t>STT</w:t>
+            </w:r>
+          </w:p>
+        </w:tc>
+        <w:tc>
+          <w:tcPr>
+            <w:tcW w:w="1366" w:type="pct"/>
+            <w:tcBorders>
+              <w:top w:val="single" w:sz="4" w:space="0" w:color="auto"/>
+              <w:left w:val="nil"/>
+              <w:bottom w:val="single" w:sz="4" w:space="0" w:color="auto"/>
+              <w:right w:val="single" w:sz="4" w:space="0" w:color="auto"/>
+            </w:tcBorders>
+            <w:shd w:val="clear" w:color="000000" w:fill="FFFFFF"/>
+            <w:vAlign w:val="center"/>
+            <w:hideMark/>
+          </w:tcPr>
+          <w:p>
+            <w:pPr>
+              <w:spacing w:after="0" w:line="240" w:lineRule="auto"/>
+              <w:jc w:val="center"/>
+              <w:rPr>
+                <w:rFonts w:ascii="Times New Roman" w:eastAsia="Times New Roman" w:hAnsi="Times New Roman" w:cs="Times New Roman"/>
+                <w:b/>
+                <w:bCs/>
+                <w:sz w:val="24"/>
+                <w:szCs w:val="24"/>
+              </w:rPr>
+            </w:pPr>
+            <w:r>
+              <w:rPr>
+                <w:rFonts w:ascii="Times New Roman" w:eastAsia="Times New Roman" w:hAnsi="Times New Roman" w:cs="Times New Roman"/>
+                <w:b/>
+                <w:bCs/>
+                <w:sz w:val="24"/>
+                <w:szCs w:val="24"/>
+              </w:rPr>
+              <w:t>Khoản mục</w:t>
+            </w:r>
+          </w:p>
+        </w:tc>
+        <w:tc>
+          <w:tcPr>
+            <w:tcW w:w="503" w:type="pct"/>
+            <w:tcBorders>
+              <w:top w:val="single" w:sz="4" w:space="0" w:color="auto"/>
+              <w:left w:val="nil"/>
+              <w:bottom w:val="single" w:sz="4" w:space="0" w:color="auto"/>
+              <w:right w:val="single" w:sz="4" w:space="0" w:color="auto"/>
+            </w:tcBorders>
+            <w:shd w:val="clear" w:color="000000" w:fill="FFFFFF"/>
+            <w:vAlign w:val="center"/>
+            <w:hideMark/>
+          </w:tcPr>
+          <w:p>
+            <w:pPr>
+              <w:spacing w:after="0" w:line="240" w:lineRule="auto"/>
+              <w:jc w:val="center"/>
+              <w:rPr>
+                <w:rFonts w:ascii="Times New Roman" w:eastAsia="Times New Roman" w:hAnsi="Times New Roman" w:cs="Times New Roman"/>
+                <w:b/>
+                <w:bCs/>
+                <w:sz w:val="24"/>
+                <w:szCs w:val="24"/>
+              </w:rPr>
+            </w:pPr>
+            <w:r>
+              <w:rPr>
+                <w:rFonts w:ascii="Times New Roman" w:eastAsia="Times New Roman" w:hAnsi="Times New Roman" w:cs="Times New Roman"/>
+                <w:b/>
+                <w:bCs/>
+                <w:sz w:val="24"/>
+                <w:szCs w:val="24"/>
+              </w:rPr>
+              <w:t>ĐVT</w:t>
+            </w:r>
+          </w:p>
+        </w:tc>
+        <w:tc>
+          <w:tcPr>
+            <w:tcW w:w="749" w:type="pct"/>
+            <w:tcBorders>
+              <w:top w:val="single" w:sz="4" w:space="0" w:color="auto"/>
+              <w:left w:val="nil"/>
+              <w:bottom w:val="single" w:sz="4" w:space="0" w:color="auto"/>
+              <w:right w:val="single" w:sz="4" w:space="0" w:color="auto"/>
+            </w:tcBorders>
+            <w:shd w:val="clear" w:color="000000" w:fill="FFFFFF"/>
+            <w:vAlign w:val="center"/>
+            <w:hideMark/>
+          </w:tcPr>
+          <w:p>
+            <w:pPr>
+              <w:spacing w:after="0" w:line="240" w:lineRule="auto"/>
+              <w:jc w:val="center"/>
+              <w:rPr>
+                <w:rFonts w:ascii="Times New Roman" w:eastAsia="Times New Roman" w:hAnsi="Times New Roman" w:cs="Times New Roman"/>
+                <w:b/>
+                <w:bCs/>
+                <w:sz w:val="24"/>
+                <w:szCs w:val="24"/>
+              </w:rPr>
+            </w:pPr>
+            <w:r>
+              <w:rPr>
+                <w:rFonts w:ascii="Times New Roman" w:eastAsia="Times New Roman" w:hAnsi="Times New Roman" w:cs="Times New Roman"/>
+                <w:b/>
+                <w:bCs/>
+                <w:sz w:val="24"/>
+                <w:szCs w:val="24"/>
+              </w:rPr>
+              <w:t>Đơn giá</w:t>
+            </w:r>
+          </w:p>
+        </w:tc>
+        <w:tc>
+          <w:tcPr>
+            <w:tcW w:w="761" w:type="pct"/>
+            <w:tcBorders>
+              <w:top w:val="single" w:sz="4" w:space="0" w:color="auto"/>
+              <w:left w:val="nil"/>
+              <w:bottom w:val="single" w:sz="4" w:space="0" w:color="auto"/>
+              <w:right w:val="single" w:sz="4" w:space="0" w:color="auto"/>
+            </w:tcBorders>
+            <w:shd w:val="clear" w:color="000000" w:fill="FFFFFF"/>
+            <w:vAlign w:val="center"/>
+            <w:hideMark/>
+          </w:tcPr>
+          <w:p>
+            <w:pPr>
+              <w:spacing w:after="0" w:line="240" w:lineRule="auto"/>
+              <w:jc w:val="center"/>
+              <w:rPr>
+                <w:rFonts w:ascii="Times New Roman" w:eastAsia="Times New Roman" w:hAnsi="Times New Roman" w:cs="Times New Roman"/>
+                <w:b/>
+                <w:bCs/>
+                <w:sz w:val="24"/>
+                <w:szCs w:val="24"/>
+              </w:rPr>
+            </w:pPr>
+            <w:r>
+              <w:rPr>
+                <w:rFonts w:ascii="Times New Roman" w:eastAsia="Times New Roman" w:hAnsi="Times New Roman" w:cs="Times New Roman"/>
+                <w:b/>
+                <w:bCs/>
+                <w:sz w:val="24"/>
+                <w:szCs w:val="24"/>
+              </w:rPr>
+              <w:t>Số lượng</w:t>
+            </w:r>
+          </w:p>
+        </w:tc>
+        <w:tc>
+          <w:tcPr>
+            <w:tcW w:w="1133" w:type="pct"/>
+            <w:tcBorders>
+              <w:top w:val="single" w:sz="4" w:space="0" w:color="auto"/>
+              <w:left w:val="nil"/>
+              <w:bottom w:val="single" w:sz="4" w:space="0" w:color="auto"/>
+              <w:right w:val="single" w:sz="4" w:space="0" w:color="auto"/>
+            </w:tcBorders>
+            <w:shd w:val="clear" w:color="000000" w:fill="FFFFFF"/>
+            <w:vAlign w:val="center"/>
+            <w:hideMark/>
+          </w:tcPr>
+          <w:p>
+            <w:pPr>
+              <w:spacing w:after="0" w:line="240" w:lineRule="auto"/>
+              <w:jc w:val="center"/>
+              <w:rPr>
+                <w:rFonts w:ascii="Times New Roman" w:eastAsia="Times New Roman" w:hAnsi="Times New Roman" w:cs="Times New Roman"/>
+                <w:b/>
+                <w:bCs/>
+                <w:sz w:val="24"/>
+                <w:szCs w:val="24"/>
+              </w:rPr>
+            </w:pPr>
+            <w:r>
+              <w:rPr>
+                <w:rFonts w:ascii="Times New Roman" w:eastAsia="Times New Roman" w:hAnsi="Times New Roman" w:cs="Times New Roman"/>
+                <w:b/>
+                <w:bCs/>
+                <w:sz w:val="24"/>
+                <w:szCs w:val="24"/>
+              </w:rPr>
+              <w:t>Thành tiền</w:t>
+            </w:r>
+          </w:p>
+        </w:tc>
+      </w:tr>
+      <w:tr>
+        <w:trPr>
+          <w:trHeight w:val="1086"/>
+        </w:trPr>
+        <w:tc>
+          <w:tcPr>
+            <w:tcW w:w="487" w:type="pct"/>
+            <w:tcBorders>
+              <w:top w:val="nil"/>
+              <w:left w:val="single" w:sz="4" w:space="0" w:color="auto"/>
+              <w:bottom w:val="single" w:sz="4" w:space="0" w:color="auto"/>
+              <w:right w:val="single" w:sz="4" w:space="0" w:color="auto"/>
+            </w:tcBorders>
+            <w:shd w:val="clear" w:color="000000" w:fill="FFFFFF"/>
+            <w:vAlign w:val="center"/>
+          </w:tcPr>
+          <w:p>
+            <w:pPr>
+              <w:spacing w:after="0" w:line="240" w:lineRule="auto"/>
+              <w:jc w:val="center"/>
+              <w:rPr>
+                <w:rFonts w:ascii="Times New Roman" w:eastAsia="Times New Roman" w:hAnsi="Times New Roman" w:cs="Times New Roman"/>
+                <w:sz w:val="24"/>
+                <w:szCs w:val="24"/>
+              </w:rPr>
+            </w:pPr>
+            <w:r>
+              <w:rPr>
+                <w:rFonts w:ascii="Times New Roman" w:eastAsia="Times New Roman" w:hAnsi="Times New Roman" w:cs="Times New Roman"/>
+                <w:sz w:val="24"/>
+                <w:szCs w:val="24"/>
+              </w:rPr>
+              <w:t>[#PA_CHIPHI_AGRI]</w:t>
+            </w:r>
+          </w:p>
+        </w:tc>
+        <w:tc>
+          <w:tcPr>
+            <w:tcW w:w="1366" w:type="pct"/>
+            <w:tcBorders>
+              <w:top w:val="nil"/>
+              <w:left w:val="nil"/>
+              <w:bottom w:val="single" w:sz="4" w:space="0" w:color="auto"/>
+              <w:right w:val="single" w:sz="4" w:space="0" w:color="auto"/>
+            </w:tcBorders>
+            <w:shd w:val="clear" w:color="000000" w:fill="FFFFFF"/>
+            <w:vAlign w:val="center"/>
+          </w:tcPr>
+          <w:p>
+            <w:pPr>
+              <w:spacing w:after="0" w:line="240" w:lineRule="auto"/>
+              <w:rPr>
+                <w:rFonts w:ascii="Times New Roman" w:eastAsia="Times New Roman" w:hAnsi="Times New Roman" w:cs="Times New Roman"/>
+                <w:sz w:val="24"/>
+                <w:szCs w:val="24"/>
+              </w:rPr>
+            </w:pPr>
+          </w:p>
+        </w:tc>
+        <w:tc>
+          <w:tcPr>
+            <w:tcW w:w="503" w:type="pct"/>
+            <w:tcBorders>
+              <w:top w:val="nil"/>
+              <w:left w:val="nil"/>
+              <w:bottom w:val="single" w:sz="4" w:space="0" w:color="auto"/>
+              <w:right w:val="single" w:sz="4" w:space="0" w:color="auto"/>
+            </w:tcBorders>
+            <w:shd w:val="clear" w:color="000000" w:fill="FFFFFF"/>
+            <w:vAlign w:val="center"/>
+          </w:tcPr>
+          <w:p>
+            <w:pPr>
+              <w:spacing w:after="0" w:line="240" w:lineRule="auto"/>
+              <w:jc w:val="center"/>
+              <w:rPr>
+                <w:rFonts w:ascii="Times New Roman" w:eastAsia="Times New Roman" w:hAnsi="Times New Roman" w:cs="Times New Roman"/>
+                <w:sz w:val="24"/>
+                <w:szCs w:val="24"/>
+              </w:rPr>
+            </w:pPr>
+          </w:p>
+        </w:tc>
+        <w:tc>
+          <w:tcPr>
+            <w:tcW w:w="749" w:type="pct"/>
+            <w:tcBorders>
+              <w:top w:val="nil"/>
+              <w:left w:val="nil"/>
+              <w:bottom w:val="single" w:sz="4" w:space="0" w:color="auto"/>
+              <w:right w:val="single" w:sz="4" w:space="0" w:color="auto"/>
+            </w:tcBorders>
+            <w:shd w:val="clear" w:color="000000" w:fill="FFFFFF"/>
+            <w:vAlign w:val="center"/>
+          </w:tcPr>
+          <w:p>
+            <w:pPr>
+              <w:spacing w:after="0" w:line="240" w:lineRule="auto"/>
+              <w:jc w:val="right"/>
+              <w:rPr>
+                <w:rFonts w:ascii="Times New Roman" w:eastAsia="Times New Roman" w:hAnsi="Times New Roman" w:cs="Times New Roman"/>
+                <w:sz w:val="24"/>
+                <w:szCs w:val="24"/>
+              </w:rPr>
+            </w:pPr>
+          </w:p>
+        </w:tc>
+        <w:tc>
+          <w:tcPr>
+            <w:tcW w:w="761" w:type="pct"/>
+            <w:tcBorders>
+              <w:top w:val="nil"/>
+              <w:left w:val="nil"/>
+              <w:bottom w:val="single" w:sz="4" w:space="0" w:color="auto"/>
+              <w:right w:val="single" w:sz="4" w:space="0" w:color="auto"/>
+            </w:tcBorders>
+            <w:shd w:val="clear" w:color="000000" w:fill="FFFFFF"/>
+            <w:vAlign w:val="center"/>
+          </w:tcPr>
+          <w:p>
+            <w:pPr>
+              <w:spacing w:after="0" w:line="240" w:lineRule="auto"/>
+              <w:jc w:val="right"/>
+              <w:rPr>
+                <w:rFonts w:ascii="Times New Roman" w:eastAsia="Times New Roman" w:hAnsi="Times New Roman" w:cs="Times New Roman"/>
+                <w:sz w:val="24"/>
+                <w:szCs w:val="24"/>
+              </w:rPr>
+            </w:pPr>
+          </w:p>
+        </w:tc>
+        <w:tc>
+          <w:tcPr>
+            <w:tcW w:w="1133" w:type="pct"/>
+            <w:tcBorders>
+              <w:top w:val="nil"/>
+              <w:left w:val="nil"/>
+              <w:bottom w:val="single" w:sz="4" w:space="0" w:color="auto"/>
+              <w:right w:val="single" w:sz="4" w:space="0" w:color="auto"/>
+            </w:tcBorders>
+            <w:shd w:val="clear" w:color="000000" w:fill="FFFFFF"/>
+            <w:vAlign w:val="center"/>
+          </w:tcPr>
+          <w:p>
+            <w:pPr>
+              <w:spacing w:after="0" w:line="240" w:lineRule="auto"/>
+              <w:jc w:val="right"/>
+              <w:rPr>
+                <w:rFonts w:ascii="Times New Roman" w:eastAsia="Times New Roman" w:hAnsi="Times New Roman" w:cs="Times New Roman"/>
+                <w:sz w:val="24"/>
+                <w:szCs w:val="24"/>
+              </w:rPr>
+            </w:pPr>
+          </w:p>
+        </w:tc>
+      </w:tr>
+      <w:tr>
+        <w:trPr>
+          <w:trHeight w:val="341"/>
+        </w:trPr>
+        <w:tc>
+          <w:tcPr>
+            <w:tcW w:w="487" w:type="pct"/>
+            <w:tcBorders>
+              <w:top w:val="nil"/>
+              <w:left w:val="single" w:sz="4" w:space="0" w:color="auto"/>
+              <w:bottom w:val="single" w:sz="4" w:space="0" w:color="auto"/>
+              <w:right w:val="single" w:sz="4" w:space="0" w:color="auto"/>
+            </w:tcBorders>
+            <w:shd w:val="clear" w:color="000000" w:fill="FFFFFF"/>
+            <w:vAlign w:val="center"/>
+            <w:hideMark/>
+          </w:tcPr>
+          <w:p>
+            <w:pPr>
+              <w:spacing w:after="0" w:line="240" w:lineRule="auto"/>
+              <w:jc w:val="center"/>
+              <w:rPr>
+                <w:rFonts w:ascii="Times New Roman" w:eastAsia="Times New Roman" w:hAnsi="Times New Roman" w:cs="Times New Roman"/>
+                <w:sz w:val="24"/>
+                <w:szCs w:val="24"/>
+              </w:rPr>
+            </w:pPr>
+            <w:r>
+              <w:rPr>
+                <w:rFonts w:ascii="Times New Roman" w:eastAsia="Times New Roman" w:hAnsi="Times New Roman" w:cs="Times New Roman"/>
+                <w:sz w:val="24"/>
+                <w:szCs w:val="24"/>
+              </w:rPr>
+              <w:t>[STT]</w:t>
+            </w:r>
+          </w:p>
+        </w:tc>
+        <w:tc>
+          <w:tcPr>
+            <w:tcW w:w="1366" w:type="pct"/>
+            <w:tcBorders>
+              <w:top w:val="nil"/>
+              <w:left w:val="nil"/>
+              <w:bottom w:val="single" w:sz="4" w:space="0" w:color="auto"/>
+              <w:right w:val="single" w:sz="4" w:space="0" w:color="auto"/>
+            </w:tcBorders>
+            <w:shd w:val="clear" w:color="000000" w:fill="FFFFFF"/>
+            <w:vAlign w:val="center"/>
+            <w:hideMark/>
+          </w:tcPr>
+          <w:p>
+            <w:pPr>
+              <w:spacing w:after="0" w:line="240" w:lineRule="auto"/>
+              <w:rPr>
+                <w:rFonts w:ascii="Times New Roman" w:eastAsia="Times New Roman" w:hAnsi="Times New Roman" w:cs="Times New Roman"/>
+                <w:sz w:val="24"/>
+                <w:szCs w:val="24"/>
+              </w:rPr>
+            </w:pPr>
+            <w:r>
+              <w:rPr>
+                <w:rFonts w:ascii="Times New Roman" w:eastAsia="Times New Roman" w:hAnsi="Times New Roman" w:cs="Times New Roman"/>
+                <w:sz w:val="24"/>
+                <w:szCs w:val="24"/>
+              </w:rPr>
+              <w:t>[Khoản mục]</w:t>
+            </w:r>
+          </w:p>
+        </w:tc>
+        <w:tc>
+          <w:tcPr>
+            <w:tcW w:w="503" w:type="pct"/>
+            <w:tcBorders>
+              <w:top w:val="nil"/>
+              <w:left w:val="nil"/>
+              <w:bottom w:val="single" w:sz="4" w:space="0" w:color="auto"/>
+              <w:right w:val="single" w:sz="4" w:space="0" w:color="auto"/>
+            </w:tcBorders>
+            <w:shd w:val="clear" w:color="000000" w:fill="FFFFFF"/>
+            <w:vAlign w:val="center"/>
+            <w:hideMark/>
+          </w:tcPr>
+          <w:p>
+            <w:pPr>
+              <w:spacing w:after="0" w:line="240" w:lineRule="auto"/>
+              <w:jc w:val="center"/>
+              <w:rPr>
+                <w:rFonts w:ascii="Times New Roman" w:eastAsia="Times New Roman" w:hAnsi="Times New Roman" w:cs="Times New Roman"/>
+                <w:sz w:val="24"/>
+                <w:szCs w:val="24"/>
+              </w:rPr>
+            </w:pPr>
+            <w:r>
+              <w:rPr>
+                <w:rFonts w:ascii="Times New Roman" w:eastAsia="Times New Roman" w:hAnsi="Times New Roman" w:cs="Times New Roman"/>
+                <w:sz w:val="24"/>
+                <w:szCs w:val="24"/>
+              </w:rPr>
+              <w:t>[ĐVT]</w:t>
+            </w:r>
+          </w:p>
+        </w:tc>
+        <w:tc>
+          <w:tcPr>
+            <w:tcW w:w="749" w:type="pct"/>
+            <w:tcBorders>
+              <w:top w:val="nil"/>
+              <w:left w:val="nil"/>
+              <w:bottom w:val="single" w:sz="4" w:space="0" w:color="auto"/>
+              <w:right w:val="single" w:sz="4" w:space="0" w:color="auto"/>
+            </w:tcBorders>
+            <w:shd w:val="clear" w:color="000000" w:fill="FFFFFF"/>
+            <w:vAlign w:val="center"/>
+            <w:hideMark/>
+          </w:tcPr>
+          <w:p>
+            <w:pPr>
+              <w:spacing w:after="0" w:line="240" w:lineRule="auto"/>
+              <w:jc w:val="right"/>
+              <w:rPr>
+                <w:rFonts w:ascii="Times New Roman" w:eastAsia="Times New Roman" w:hAnsi="Times New Roman" w:cs="Times New Roman"/>
+                <w:sz w:val="24"/>
+                <w:szCs w:val="24"/>
+              </w:rPr>
+            </w:pPr>
+            <w:r>
+              <w:rPr>
+                <w:rFonts w:ascii="Times New Roman" w:eastAsia="Times New Roman" w:hAnsi="Times New Roman" w:cs="Times New Roman"/>
+                <w:sz w:val="24"/>
+                <w:szCs w:val="24"/>
+              </w:rPr>
+              <w:t>[Đơn giá]</w:t>
+            </w:r>
+          </w:p>
+        </w:tc>
+        <w:tc>
+          <w:tcPr>
+            <w:tcW w:w="761" w:type="pct"/>
+            <w:tcBorders>
+              <w:top w:val="nil"/>
+              <w:left w:val="nil"/>
+              <w:bottom w:val="single" w:sz="4" w:space="0" w:color="auto"/>
+              <w:right w:val="single" w:sz="4" w:space="0" w:color="auto"/>
+            </w:tcBorders>
+            <w:shd w:val="clear" w:color="000000" w:fill="FFFFFF"/>
+            <w:vAlign w:val="center"/>
+            <w:hideMark/>
+          </w:tcPr>
+          <w:p>
+            <w:pPr>
+              <w:spacing w:after="0" w:line="240" w:lineRule="auto"/>
+              <w:jc w:val="right"/>
+              <w:rPr>
+                <w:rFonts w:ascii="Times New Roman" w:eastAsia="Times New Roman" w:hAnsi="Times New Roman" w:cs="Times New Roman"/>
+                <w:sz w:val="24"/>
+                <w:szCs w:val="24"/>
+              </w:rPr>
+            </w:pPr>
+            <w:r>
+              <w:rPr>
+                <w:rFonts w:ascii="Times New Roman" w:eastAsia="Times New Roman" w:hAnsi="Times New Roman" w:cs="Times New Roman"/>
+                <w:sz w:val="24"/>
+                <w:szCs w:val="24"/>
+              </w:rPr>
+              <w:t>[Số lượng]</w:t>
+            </w:r>
+          </w:p>
+        </w:tc>
+        <w:tc>
+          <w:tcPr>
+            <w:tcW w:w="1133" w:type="pct"/>
+            <w:tcBorders>
+              <w:top w:val="nil"/>
+              <w:left w:val="nil"/>
+              <w:bottom w:val="single" w:sz="4" w:space="0" w:color="auto"/>
+              <w:right w:val="single" w:sz="4" w:space="0" w:color="auto"/>
+            </w:tcBorders>
+            <w:shd w:val="clear" w:color="000000" w:fill="FFFFFF"/>
+            <w:vAlign w:val="center"/>
+            <w:hideMark/>
+          </w:tcPr>
+          <w:p>
+            <w:pPr>
+              <w:spacing w:after="0" w:line="240" w:lineRule="auto"/>
+              <w:jc w:val="right"/>
+              <w:rPr>
+                <w:rFonts w:ascii="Times New Roman" w:eastAsia="Times New Roman" w:hAnsi="Times New Roman" w:cs="Times New Roman"/>
+                <w:sz w:val="24"/>
+                <w:szCs w:val="24"/>
+              </w:rPr>
+            </w:pPr>
+            <w:r>
+              <w:rPr>
+                <w:rFonts w:ascii="Times New Roman" w:eastAsia="Times New Roman" w:hAnsi="Times New Roman" w:cs="Times New Roman"/>
+                <w:sz w:val="24"/>
+                <w:szCs w:val="24"/>
+              </w:rPr>
+              <w:t>[Thành tiền]</w:t>
+            </w:r>
+          </w:p>
+        </w:tc>
+      </w:tr>
+      <w:tr>
+        <w:trPr>
+          <w:trHeight w:val="843"/>
+        </w:trPr>
+        <w:tc>
+          <w:tcPr>
+            <w:tcW w:w="487" w:type="pct"/>
+            <w:tcBorders>
+              <w:top w:val="nil"/>
+              <w:left w:val="single" w:sz="4" w:space="0" w:color="auto"/>
+              <w:bottom w:val="single" w:sz="4" w:space="0" w:color="auto"/>
+              <w:right w:val="single" w:sz="4" w:space="0" w:color="auto"/>
+            </w:tcBorders>
+            <w:shd w:val="clear" w:color="000000" w:fill="FFFFFF"/>
+            <w:vAlign w:val="center"/>
+          </w:tcPr>
+          <w:p>
+            <w:pPr>
+              <w:spacing w:after="0" w:line="240" w:lineRule="auto"/>
+              <w:jc w:val="center"/>
+              <w:rPr>
+                <w:rFonts w:ascii="Times New Roman" w:eastAsia="Times New Roman" w:hAnsi="Times New Roman" w:cs="Times New Roman"/>
+                <w:sz w:val="24"/>
+                <w:szCs w:val="24"/>
+              </w:rPr>
+            </w:pPr>
+            <w:r>
+              <w:rPr>
+                <w:rFonts w:ascii="Times New Roman" w:eastAsia="Times New Roman" w:hAnsi="Times New Roman" w:cs="Times New Roman"/>
+                <w:sz w:val="24"/>
+                <w:szCs w:val="24"/>
+              </w:rPr>
+              <w:t>[/PA_CHIPHI_AGRI]</w:t>
+            </w:r>
+          </w:p>
+        </w:tc>
+        <w:tc>
+          <w:tcPr>
+            <w:tcW w:w="1366" w:type="pct"/>
+            <w:tcBorders>
+              <w:top w:val="nil"/>
+              <w:left w:val="nil"/>
+              <w:bottom w:val="single" w:sz="4" w:space="0" w:color="auto"/>
+              <w:right w:val="single" w:sz="4" w:space="0" w:color="auto"/>
+            </w:tcBorders>
+            <w:shd w:val="clear" w:color="000000" w:fill="FFFFFF"/>
+            <w:vAlign w:val="center"/>
+          </w:tcPr>
+          <w:p>
+            <w:pPr>
+              <w:spacing w:after="0" w:line="240" w:lineRule="auto"/>
+              <w:rPr>
+                <w:rFonts w:ascii="Times New Roman" w:eastAsia="Times New Roman" w:hAnsi="Times New Roman" w:cs="Times New Roman"/>
+                <w:sz w:val="24"/>
+                <w:szCs w:val="24"/>
+              </w:rPr>
+            </w:pPr>
+          </w:p>
+        </w:tc>
+        <w:tc>
+          <w:tcPr>
+            <w:tcW w:w="503" w:type="pct"/>
+            <w:tcBorders>
+              <w:top w:val="nil"/>
+              <w:left w:val="nil"/>
+              <w:bottom w:val="single" w:sz="4" w:space="0" w:color="auto"/>
+              <w:right w:val="single" w:sz="4" w:space="0" w:color="auto"/>
+            </w:tcBorders>
+            <w:shd w:val="clear" w:color="000000" w:fill="FFFFFF"/>
+            <w:vAlign w:val="center"/>
+          </w:tcPr>
+          <w:p>
+            <w:pPr>
+              <w:spacing w:after="0" w:line="240" w:lineRule="auto"/>
+              <w:jc w:val="center"/>
+              <w:rPr>
+                <w:rFonts w:ascii="Times New Roman" w:eastAsia="Times New Roman" w:hAnsi="Times New Roman" w:cs="Times New Roman"/>
+                <w:sz w:val="24"/>
+                <w:szCs w:val="24"/>
+              </w:rPr>
+            </w:pPr>
+          </w:p>
+        </w:tc>
+        <w:tc>
+          <w:tcPr>
+            <w:tcW w:w="749" w:type="pct"/>
+            <w:tcBorders>
+              <w:top w:val="nil"/>
+              <w:left w:val="nil"/>
+              <w:bottom w:val="single" w:sz="4" w:space="0" w:color="auto"/>
+              <w:right w:val="single" w:sz="4" w:space="0" w:color="auto"/>
+            </w:tcBorders>
+            <w:shd w:val="clear" w:color="000000" w:fill="FFFFFF"/>
+            <w:vAlign w:val="center"/>
+          </w:tcPr>
+          <w:p>
+            <w:pPr>
+              <w:spacing w:after="0" w:line="240" w:lineRule="auto"/>
+              <w:jc w:val="right"/>
+              <w:rPr>
+                <w:rFonts w:ascii="Times New Roman" w:eastAsia="Times New Roman" w:hAnsi="Times New Roman" w:cs="Times New Roman"/>
+                <w:sz w:val="24"/>
+                <w:szCs w:val="24"/>
+              </w:rPr>
+            </w:pPr>
+          </w:p>
+        </w:tc>
+        <w:tc>
+          <w:tcPr>
+            <w:tcW w:w="761" w:type="pct"/>
+            <w:tcBorders>
+              <w:top w:val="nil"/>
+              <w:left w:val="nil"/>
+              <w:bottom w:val="single" w:sz="4" w:space="0" w:color="auto"/>
+              <w:right w:val="single" w:sz="4" w:space="0" w:color="auto"/>
+            </w:tcBorders>
+            <w:shd w:val="clear" w:color="000000" w:fill="FFFFFF"/>
+            <w:vAlign w:val="center"/>
+          </w:tcPr>
+          <w:p>
+            <w:pPr>
+              <w:spacing w:after="0" w:line="240" w:lineRule="auto"/>
+              <w:jc w:val="right"/>
+              <w:rPr>
+                <w:rFonts w:ascii="Times New Roman" w:eastAsia="Times New Roman" w:hAnsi="Times New Roman" w:cs="Times New Roman"/>
+                <w:sz w:val="24"/>
+                <w:szCs w:val="24"/>
+              </w:rPr>
+            </w:pPr>
+          </w:p>
+        </w:tc>
+        <w:tc>
+          <w:tcPr>
+            <w:tcW w:w="1133" w:type="pct"/>
+            <w:tcBorders>
+              <w:top w:val="nil"/>
+              <w:left w:val="nil"/>
+              <w:bottom w:val="single" w:sz="4" w:space="0" w:color="auto"/>
+              <w:right w:val="single" w:sz="4" w:space="0" w:color="auto"/>
+            </w:tcBorders>
+            <w:shd w:val="clear" w:color="000000" w:fill="FFFFFF"/>
+            <w:vAlign w:val="center"/>
+          </w:tcPr>
+          <w:p>
+            <w:pPr>
+              <w:spacing w:after="0" w:line="240" w:lineRule="auto"/>
+              <w:jc w:val="right"/>
+              <w:rPr>
+                <w:rFonts w:ascii="Times New Roman" w:eastAsia="Times New Roman" w:hAnsi="Times New Roman" w:cs="Times New Roman"/>
+                <w:sz w:val="24"/>
+                <w:szCs w:val="24"/>
+              </w:rPr>
+            </w:pPr>
+          </w:p>
+        </w:tc>
+      </w:tr>
+      <w:tr>
+        <w:trPr>
+          <w:trHeight w:val="312"/>
+        </w:trPr>
+        <w:tc>
+          <w:tcPr>
+            <w:tcW w:w="487" w:type="pct"/>
+            <w:tcBorders>
+              <w:top w:val="nil"/>
+              <w:left w:val="single" w:sz="4" w:space="0" w:color="auto"/>
+              <w:bottom w:val="single" w:sz="4" w:space="0" w:color="auto"/>
+              <w:right w:val="single" w:sz="4" w:space="0" w:color="auto"/>
+            </w:tcBorders>
+            <w:shd w:val="clear" w:color="000000" w:fill="FFFFFF"/>
+            <w:vAlign w:val="center"/>
+            <w:hideMark/>
+          </w:tcPr>
+          <w:p>
+            <w:pPr>
+              <w:spacing w:after="0" w:line="240" w:lineRule="auto"/>
+              <w:jc w:val="center"/>
+              <w:rPr>
+                <w:rFonts w:ascii="Times New Roman" w:eastAsia="Times New Roman" w:hAnsi="Times New Roman" w:cs="Times New Roman"/>
+                <w:b/>
+                <w:bCs/>
+                <w:sz w:val="24"/>
+                <w:szCs w:val="24"/>
+              </w:rPr>
+            </w:pPr>
+          </w:p>
+        </w:tc>
+        <w:tc>
+          <w:tcPr>
+            <w:tcW w:w="1366" w:type="pct"/>
+            <w:tcBorders>
+              <w:top w:val="nil"/>
+              <w:left w:val="nil"/>
+              <w:bottom w:val="single" w:sz="4" w:space="0" w:color="auto"/>
+              <w:right w:val="single" w:sz="4" w:space="0" w:color="auto"/>
+            </w:tcBorders>
+            <w:shd w:val="clear" w:color="000000" w:fill="FFFFFF"/>
+            <w:vAlign w:val="center"/>
+            <w:hideMark/>
+          </w:tcPr>
+          <w:p>
+            <w:pPr>
+              <w:spacing w:after="0" w:line="240" w:lineRule="auto"/>
+              <w:jc w:val="center"/>
+              <w:rPr>
+                <w:rFonts w:ascii="Times New Roman" w:eastAsia="Times New Roman" w:hAnsi="Times New Roman" w:cs="Times New Roman"/>
+                <w:b/>
+                <w:bCs/>
+                <w:sz w:val="24"/>
+                <w:szCs w:val="24"/>
+              </w:rPr>
+            </w:pPr>
+            <w:r>
+              <w:rPr>
+                <w:rFonts w:ascii="Times New Roman" w:eastAsia="Times New Roman" w:hAnsi="Times New Roman" w:cs="Times New Roman"/>
+                <w:b/>
+                <w:bCs/>
+                <w:sz w:val="24"/>
+                <w:szCs w:val="24"/>
+              </w:rPr>
+              <w:t> Tổng cộng</w:t>
+            </w:r>
+          </w:p>
+        </w:tc>
+        <w:tc>
+          <w:tcPr>
+            <w:tcW w:w="503" w:type="pct"/>
+            <w:tcBorders>
+              <w:top w:val="nil"/>
+              <w:left w:val="nil"/>
+              <w:bottom w:val="single" w:sz="4" w:space="0" w:color="auto"/>
+              <w:right w:val="single" w:sz="4" w:space="0" w:color="auto"/>
+            </w:tcBorders>
+            <w:shd w:val="clear" w:color="000000" w:fill="FFFFFF"/>
+            <w:vAlign w:val="center"/>
+            <w:hideMark/>
+          </w:tcPr>
+          <w:p>
+            <w:pPr>
+              <w:spacing w:after="0" w:line="240" w:lineRule="auto"/>
+              <w:jc w:val="center"/>
+              <w:rPr>
+                <w:rFonts w:ascii="Times New Roman" w:eastAsia="Times New Roman" w:hAnsi="Times New Roman" w:cs="Times New Roman"/>
+                <w:b/>
+                <w:bCs/>
+                <w:sz w:val="24"/>
+                <w:szCs w:val="24"/>
+              </w:rPr>
+            </w:pPr>
+            <w:r>
+              <w:rPr>
+                <w:rFonts w:ascii="Times New Roman" w:eastAsia="Times New Roman" w:hAnsi="Times New Roman" w:cs="Times New Roman"/>
+                <w:b/>
+                <w:bCs/>
+                <w:sz w:val="24"/>
+                <w:szCs w:val="24"/>
+              </w:rPr>
+              <w:t> </w:t>
+            </w:r>
+          </w:p>
+        </w:tc>
+        <w:tc>
+          <w:tcPr>
+            <w:tcW w:w="749" w:type="pct"/>
+            <w:tcBorders>
+              <w:top w:val="nil"/>
+              <w:left w:val="nil"/>
+              <w:bottom w:val="single" w:sz="4" w:space="0" w:color="auto"/>
+              <w:right w:val="single" w:sz="4" w:space="0" w:color="auto"/>
+            </w:tcBorders>
+            <w:shd w:val="clear" w:color="000000" w:fill="FFFFFF"/>
+            <w:vAlign w:val="center"/>
+            <w:hideMark/>
+          </w:tcPr>
+          <w:p>
+            <w:pPr>
+              <w:spacing w:after="0" w:line="240" w:lineRule="auto"/>
+              <w:jc w:val="center"/>
+              <w:rPr>
+                <w:rFonts w:ascii="Times New Roman" w:eastAsia="Times New Roman" w:hAnsi="Times New Roman" w:cs="Times New Roman"/>
+                <w:b/>
+                <w:bCs/>
+                <w:sz w:val="24"/>
+                <w:szCs w:val="24"/>
+              </w:rPr>
+            </w:pPr>
+            <w:r>
+              <w:rPr>
+                <w:rFonts w:ascii="Times New Roman" w:eastAsia="Times New Roman" w:hAnsi="Times New Roman" w:cs="Times New Roman"/>
+                <w:b/>
+                <w:bCs/>
+                <w:sz w:val="24"/>
+                <w:szCs w:val="24"/>
+              </w:rPr>
+              <w:t> </w:t>
+            </w:r>
+          </w:p>
+        </w:tc>
+        <w:tc>
+          <w:tcPr>
+            <w:tcW w:w="761" w:type="pct"/>
+            <w:tcBorders>
+              <w:top w:val="nil"/>
+              <w:left w:val="nil"/>
+              <w:bottom w:val="single" w:sz="4" w:space="0" w:color="auto"/>
+              <w:right w:val="single" w:sz="4" w:space="0" w:color="auto"/>
+            </w:tcBorders>
+            <w:shd w:val="clear" w:color="000000" w:fill="FFFFFF"/>
+            <w:vAlign w:val="center"/>
+            <w:hideMark/>
+          </w:tcPr>
+          <w:p>
+            <w:pPr>
+              <w:spacing w:after="0" w:line="240" w:lineRule="auto"/>
+              <w:jc w:val="center"/>
+              <w:rPr>
+                <w:rFonts w:ascii="Times New Roman" w:eastAsia="Times New Roman" w:hAnsi="Times New Roman" w:cs="Times New Roman"/>
+                <w:b/>
+                <w:bCs/>
+                <w:sz w:val="24"/>
+                <w:szCs w:val="24"/>
+              </w:rPr>
+            </w:pPr>
+            <w:r>
+              <w:rPr>
+                <w:rFonts w:ascii="Times New Roman" w:eastAsia="Times New Roman" w:hAnsi="Times New Roman" w:cs="Times New Roman"/>
+                <w:b/>
+                <w:bCs/>
+                <w:sz w:val="24"/>
+                <w:szCs w:val="24"/>
+              </w:rPr>
+              <w:t> </w:t>
+            </w:r>
+          </w:p>
+        </w:tc>
+        <w:tc>
+          <w:tcPr>
+            <w:tcW w:w="1133" w:type="pct"/>
+            <w:tcBorders>
+              <w:top w:val="nil"/>
+              <w:left w:val="nil"/>
+              <w:bottom w:val="single" w:sz="4" w:space="0" w:color="auto"/>
+              <w:right w:val="single" w:sz="4" w:space="0" w:color="auto"/>
+            </w:tcBorders>
+            <w:shd w:val="clear" w:color="000000" w:fill="FFFFFF"/>
+            <w:vAlign w:val="center"/>
+            <w:hideMark/>
+          </w:tcPr>
+          <w:p>
+            <w:pPr>
+              <w:spacing w:after="0" w:line="240" w:lineRule="auto"/>
+              <w:jc w:val="right"/>
+              <w:rPr>
+                <w:rFonts w:ascii="Times New Roman" w:eastAsia="Times New Roman" w:hAnsi="Times New Roman" w:cs="Times New Roman"/>
+                <w:b/>
+                <w:bCs/>
+                <w:sz w:val="24"/>
+                <w:szCs w:val="24"/>
+              </w:rPr>
+            </w:pPr>
+            <w:r>
+              <w:rPr>
+                <w:rFonts w:ascii="Times New Roman" w:eastAsia="Times New Roman" w:hAnsi="Times New Roman" w:cs="Times New Roman"/>
+                <w:b/>
+                <w:bCs/>
+                <w:sz w:val="24"/>
+                <w:szCs w:val="24"/>
+              </w:rPr>
+              <w:t>[HĐTD.Nguồn trả nợ]</w:t>
+            </w:r>
+          </w:p>
+        </w:tc>
+      </w:tr>
+    </w:tbl>
+    <w:p>
+      <w:pPr>
+        <w:pStyle w:val="ListParagraph"/>
+        <w:spacing w:after="0" w:line="276" w:lineRule="auto"/>
+        <w:ind w:left="0" w:firstLine="567"/>
+        <w:jc w:val="both"/>
+        <w:rPr>
+          <w:rFonts w:ascii="Times New Roman" w:eastAsia="Times New Roman" w:hAnsi="Times New Roman" w:cs="Times New Roman"/>
+          <w:sz w:val="26"/>
+          <w:szCs w:val="28"/>
+          <w:lang w:val="de-DE"/>
+        </w:rPr>
+      </w:pPr>
+      <w:r>
+        <w:rPr>
+          <w:rFonts w:ascii="Times New Roman" w:eastAsia="Times New Roman" w:hAnsi="Times New Roman" w:cs="Times New Roman"/>
+          <w:sz w:val="26"/>
+          <w:szCs w:val="28"/>
+          <w:lang w:val="de-DE"/>
+        </w:rPr>
+        <w:t xml:space="preserve">- </w:t>
+      </w:r>
+      <w:r>
+        <w:rPr>
+          <w:rFonts w:ascii="Times New Roman" w:eastAsia="Times New Roman" w:hAnsi="Times New Roman" w:cs="Times New Roman"/>
+          <w:sz w:val="26"/>
+          <w:szCs w:val="28"/>
+          <w:lang w:val="de-DE"/>
+        </w:rPr>
+        <w:t>Chi phí khấu trừ bình quân năm: [HĐTD.Tổng chi phí khấu trừ] đồng;</w:t>
+      </w:r>
+    </w:p>
+    <w:p>
+      <w:pPr>
+        <w:pStyle w:val="ListParagraph"/>
+        <w:spacing w:after="0" w:line="276" w:lineRule="auto"/>
+        <w:ind w:left="0" w:firstLine="567"/>
+        <w:jc w:val="both"/>
+        <w:rPr>
+          <w:rFonts w:ascii="Times New Roman" w:eastAsia="Times New Roman" w:hAnsi="Times New Roman" w:cs="Times New Roman"/>
+          <w:sz w:val="26"/>
+          <w:szCs w:val="28"/>
+          <w:lang w:val="de-DE"/>
+        </w:rPr>
+      </w:pPr>
+      <w:r>
+        <w:rPr>
+          <w:rFonts w:ascii="Times New Roman" w:eastAsia="Times New Roman" w:hAnsi="Times New Roman" w:cs="Times New Roman"/>
+          <w:sz w:val="26"/>
+          <w:szCs w:val="28"/>
+          <w:lang w:val="de-DE"/>
+        </w:rPr>
+        <w:lastRenderedPageBreak/>
+        <w:t xml:space="preserve">- </w:t>
+      </w:r>
+      <w:r>
+        <w:rPr>
+          <w:rFonts w:ascii="Times New Roman" w:eastAsia="Times New Roman" w:hAnsi="Times New Roman" w:cs="Times New Roman"/>
+          <w:sz w:val="26"/>
+          <w:szCs w:val="28"/>
+          <w:lang w:val="de-DE"/>
+        </w:rPr>
+        <w:t>Thu nhập bình quân còn lại để trả nợ: [HĐTD.Nguồn trả nợ] đồng – [HĐTD.Tổng chi phí khấu trừ] đồng = [HĐTD.Thu nhập trả nợ cho Agribank] đồng/năm.</w:t>
+      </w:r>
+    </w:p>
+    <w:p>
+      <w:pPr>
+        <w:pStyle w:val="ListParagraph"/>
+        <w:spacing w:after="0" w:line="276" w:lineRule="auto"/>
+        <w:ind w:left="0" w:firstLine="567"/>
+        <w:jc w:val="both"/>
+        <w:rPr>
+          <w:rFonts w:ascii="Times New Roman" w:eastAsia="Times New Roman" w:hAnsi="Times New Roman" w:cs="Times New Roman"/>
+          <w:sz w:val="26"/>
+          <w:szCs w:val="28"/>
+          <w:lang w:val="de-DE"/>
+        </w:rPr>
+      </w:pPr>
+      <w:r>
+        <w:rPr>
+          <w:rFonts w:ascii="Times New Roman" w:eastAsia="Times New Roman" w:hAnsi="Times New Roman" w:cs="Times New Roman"/>
+          <w:sz w:val="26"/>
+          <w:szCs w:val="28"/>
+          <w:lang w:val="de-DE"/>
+        </w:rPr>
+        <w:t>b</w:t>
+      </w:r>
+      <w:r>
+        <w:rPr>
+          <w:rFonts w:ascii="Times New Roman" w:eastAsia="Times New Roman" w:hAnsi="Times New Roman" w:cs="Times New Roman"/>
+          <w:sz w:val="26"/>
+          <w:szCs w:val="28"/>
+          <w:lang w:val="de-DE"/>
+        </w:rPr>
+        <w:t>) Định kỳ trả nợ:</w:t>
+      </w:r>
+    </w:p>
+    <w:p>
+      <w:pPr>
+        <w:pStyle w:val="ListParagraph"/>
+        <w:spacing w:after="0" w:line="276" w:lineRule="auto"/>
+        <w:ind w:left="0" w:firstLine="567"/>
+        <w:jc w:val="both"/>
+        <w:rPr>
+          <w:rFonts w:ascii="Times New Roman" w:eastAsia="Times New Roman" w:hAnsi="Times New Roman" w:cs="Times New Roman"/>
+          <w:sz w:val="26"/>
+          <w:szCs w:val="28"/>
+          <w:lang w:val="de-DE"/>
+        </w:rPr>
+      </w:pPr>
+    </w:p>
+    <w:p>
+      <w:pPr>
+        <w:pStyle w:val="ListParagraph"/>
+        <w:spacing w:after="0" w:line="276" w:lineRule="auto"/>
+        <w:ind w:left="0" w:firstLine="567"/>
+        <w:jc w:val="both"/>
+        <w:rPr>
+          <w:rFonts w:ascii="Times New Roman" w:eastAsia="Times New Roman" w:hAnsi="Times New Roman" w:cs="Times New Roman"/>
+          <w:sz w:val="26"/>
+          <w:szCs w:val="28"/>
+          <w:lang w:val="de-DE"/>
+        </w:rPr>
+      </w:pPr>
+      <w:r>
+        <w:rPr>
+          <w:rFonts w:ascii="Times New Roman" w:eastAsia="Times New Roman" w:hAnsi="Times New Roman" w:cs="Times New Roman"/>
+          <w:sz w:val="26"/>
+          <w:szCs w:val="28"/>
+          <w:lang w:val="de-DE"/>
+        </w:rPr>
+        <w:t>Trả lãi vay</w:t>
+      </w:r>
+      <w:r>
+        <w:rPr>
+          <w:rFonts w:ascii="Times New Roman" w:eastAsia="Times New Roman" w:hAnsi="Times New Roman" w:cs="Times New Roman"/>
+          <w:sz w:val="26"/>
+          <w:szCs w:val="28"/>
+          <w:lang w:val="de-DE"/>
+        </w:rPr>
+        <w:t xml:space="preserve"> (lãi suất bình quân </w:t>
+      </w:r>
+      <w:r>
+        <w:rPr>
+          <w:rFonts w:ascii="Times New Roman" w:eastAsia="Times New Roman" w:hAnsi="Times New Roman" w:cs="Times New Roman"/>
+          <w:sz w:val="26"/>
+          <w:szCs w:val="28"/>
+          <w:lang w:val="pt-BR"/>
+        </w:rPr>
+        <w:t>[HĐTD.Lãi suất vay]</w:t>
+      </w:r>
+      <w:r>
+        <w:rPr>
+          <w:rFonts w:ascii="Times New Roman" w:eastAsia="Times New Roman" w:hAnsi="Times New Roman" w:cs="Times New Roman"/>
+          <w:sz w:val="26"/>
+          <w:szCs w:val="28"/>
+          <w:lang w:val="pt-BR"/>
+        </w:rPr>
+        <w:t>)</w:t>
+      </w:r>
+      <w:r>
+        <w:rPr>
+          <w:rFonts w:ascii="Times New Roman" w:eastAsia="Times New Roman" w:hAnsi="Times New Roman" w:cs="Times New Roman"/>
+          <w:sz w:val="26"/>
+          <w:szCs w:val="28"/>
+          <w:lang w:val="de-DE"/>
+        </w:rPr>
+        <w:t>: hàng tháng;</w:t>
+      </w:r>
+    </w:p>
+    <w:p>
+      <w:pPr>
+        <w:pStyle w:val="ListParagraph"/>
+        <w:spacing w:after="0" w:line="276" w:lineRule="auto"/>
+        <w:ind w:left="0" w:firstLine="567"/>
+        <w:contextualSpacing w:val="0"/>
+        <w:jc w:val="both"/>
+        <w:rPr>
+          <w:rFonts w:ascii="Times New Roman" w:eastAsia="Times New Roman" w:hAnsi="Times New Roman" w:cs="Times New Roman"/>
+          <w:sz w:val="26"/>
+          <w:szCs w:val="28"/>
+          <w:lang w:val="de-DE"/>
+        </w:rPr>
+      </w:pPr>
+      <w:r>
+        <w:rPr>
+          <w:rFonts w:ascii="Times New Roman" w:eastAsia="Times New Roman" w:hAnsi="Times New Roman" w:cs="Times New Roman"/>
+          <w:sz w:val="26"/>
+          <w:szCs w:val="28"/>
+          <w:lang w:val="de-DE"/>
+        </w:rPr>
+        <w:t xml:space="preserve">Trả gốc: Khách hàng cam kết sử dụng nguồn thu nhập từ [HĐTD.Mô tả nguồn trả nợ] để trả nợ gốc cho khoản vay tại </w:t>
+      </w:r>
+      <w:r>
+        <w:rPr>
+          <w:rFonts w:ascii="Times New Roman" w:eastAsia="Calibri" w:hAnsi="Times New Roman" w:cs="Times New Roman"/>
           <w:bCs/>
           <w:sz w:val="26"/>
           <w:szCs w:val="26"/>
-        </w:rPr>
-      </w:pPr>
-      <w:r>
-        <w:rPr>
-          <w:rFonts w:ascii="Times New Roman" w:hAnsi="Times New Roman" w:cs="Times New Roman"/>
-          <w:b/>
-          <w:bCs/>
-          <w:sz w:val="26"/>
-          <w:szCs w:val="26"/>
-        </w:rPr>
-        <w:t>4.1. Khả năng trả nợ của khách hàng:</w:t>
-      </w:r>
-    </w:p>
-    <w:p>
-      <w:pPr>
-        <w:spacing w:after="0" w:line="276" w:lineRule="auto"/>
-        <w:ind w:firstLine="567"/>
-        <w:jc w:val="both"/>
-        <w:rPr>
-          <w:rFonts w:ascii="Times New Roman" w:hAnsi="Times New Roman" w:cs="Times New Roman"/>
-          <w:sz w:val="26"/>
-          <w:szCs w:val="26"/>
-        </w:rPr>
-      </w:pPr>
-      <w:r>
-        <w:rPr>
-          <w:rFonts w:ascii="Times New Roman" w:hAnsi="Times New Roman" w:cs="Times New Roman"/>
-          <w:sz w:val="26"/>
-          <w:szCs w:val="26"/>
-        </w:rPr>
-        <w:t>a) Thu nhập để trả nợ: Từ lương và phụ cấp của [PA.Mô tả người trả nợ]. [PA.Câu thu nhập];</w:t>
-      </w:r>
-    </w:p>
-    <w:p>
-      <w:pPr>
-        <w:spacing w:after="0" w:line="276" w:lineRule="auto"/>
-        <w:ind w:firstLine="567"/>
-        <w:jc w:val="both"/>
-        <w:rPr>
-          <w:rFonts w:ascii="Times New Roman" w:hAnsi="Times New Roman" w:cs="Times New Roman"/>
-          <w:sz w:val="26"/>
-          <w:szCs w:val="26"/>
-        </w:rPr>
-      </w:pPr>
-      <w:r>
-        <w:rPr>
-          <w:rFonts w:ascii="Times New Roman" w:hAnsi="Times New Roman" w:cs="Times New Roman"/>
-          <w:sz w:val="26"/>
-          <w:szCs w:val="26"/>
-        </w:rPr>
-        <w:t>Tổng lương và phụ cấp bình quân trong [PA.Kỳ text]: [PA.Tổng thu nhập kỳ] đồng</w:t>
-      </w:r>
-    </w:p>
-    <w:p>
-      <w:pPr>
-        <w:spacing w:after="0" w:line="276" w:lineRule="auto"/>
-        <w:ind w:firstLine="567"/>
-        <w:jc w:val="both"/>
-        <w:rPr>
-          <w:rFonts w:ascii="Times New Roman" w:hAnsi="Times New Roman" w:cs="Times New Roman"/>
-          <w:sz w:val="26"/>
-          <w:szCs w:val="26"/>
-        </w:rPr>
-      </w:pPr>
-      <w:r>
-        <w:rPr>
-          <w:rFonts w:ascii="Times New Roman" w:hAnsi="Times New Roman" w:cs="Times New Roman"/>
-          <w:sz w:val="26"/>
-          <w:szCs w:val="26"/>
-        </w:rPr>
-        <w:t>b) Tổng chi phí bình quân trong [PA.Kỳ text]: [PA.Tổng chi phí kỳ] đồng, trong đó:</w:t>
-      </w:r>
-    </w:p>
-    <w:p>
-      <w:pPr>
-        <w:spacing w:after="0" w:line="276" w:lineRule="auto"/>
-        <w:ind w:firstLine="567"/>
-        <w:jc w:val="both"/>
-        <w:rPr>
-          <w:rFonts w:ascii="Times New Roman" w:hAnsi="Times New Roman" w:cs="Times New Roman"/>
-          <w:sz w:val="26"/>
-          <w:szCs w:val="26"/>
-        </w:rPr>
-      </w:pPr>
-      <w:r>
-        <w:rPr>
-          <w:rFonts w:ascii="Times New Roman" w:hAnsi="Times New Roman" w:cs="Times New Roman"/>
-          <w:sz w:val="26"/>
-          <w:szCs w:val="26"/>
-        </w:rPr>
-        <w:t>- Chi phí sinh hoạt bình quân trong [PA.Kỳ text]: [PA.Chi phí sinh hoạt kỳ] đồng;</w:t>
-      </w:r>
-    </w:p>
-    <w:p>
-      <w:pPr>
-        <w:spacing w:after="0" w:line="276" w:lineRule="auto"/>
-        <w:ind w:firstLine="567"/>
-        <w:jc w:val="both"/>
-        <w:rPr>
-          <w:rFonts w:ascii="Times New Roman" w:hAnsi="Times New Roman" w:cs="Times New Roman"/>
-          <w:sz w:val="26"/>
-          <w:szCs w:val="26"/>
-        </w:rPr>
-      </w:pPr>
-      <w:r>
-        <w:rPr>
-          <w:rFonts w:ascii="Times New Roman" w:hAnsi="Times New Roman" w:cs="Times New Roman"/>
-          <w:sz w:val="26"/>
-          <w:szCs w:val="26"/>
-        </w:rPr>
-        <w:t>- Chi phí lãi vay (lãi suất bình quân là [PA.Lãi suất vay khác]/năm): [PA.Chi phí lãi vay kỳ] đồng;</w:t>
-      </w:r>
-    </w:p>
-    <w:p>
-      <w:pPr>
-        <w:spacing w:after="0" w:line="276" w:lineRule="auto"/>
-        <w:ind w:firstLine="567"/>
-        <w:jc w:val="both"/>
-        <w:rPr>
-          <w:rFonts w:ascii="Times New Roman" w:hAnsi="Times New Roman" w:cs="Times New Roman"/>
-          <w:sz w:val="26"/>
-          <w:szCs w:val="26"/>
-        </w:rPr>
-      </w:pPr>
-      <w:r>
-        <w:rPr>
-          <w:rFonts w:ascii="Times New Roman" w:hAnsi="Times New Roman" w:cs="Times New Roman"/>
-          <w:sz w:val="26"/>
-          <w:szCs w:val="26"/>
-        </w:rPr>
-        <w:t>- Chi phí khác (các khoản vay khác;...): [PA.Chi phí khác kỳ] đồng.</w:t>
-      </w:r>
-    </w:p>
-    <w:p>
-      <w:pPr>
-        <w:spacing w:after="0" w:line="276" w:lineRule="auto"/>
-        <w:ind w:firstLine="567"/>
-        <w:jc w:val="both"/>
-        <w:rPr>
-          <w:rFonts w:ascii="Times New Roman" w:hAnsi="Times New Roman" w:cs="Times New Roman"/>
-          <w:sz w:val="26"/>
-          <w:szCs w:val="26"/>
-        </w:rPr>
-      </w:pPr>
-      <w:r>
-        <w:rPr>
-          <w:rFonts w:ascii="Times New Roman" w:hAnsi="Times New Roman" w:cs="Times New Roman"/>
-          <w:sz w:val="26"/>
-          <w:szCs w:val="26"/>
-        </w:rPr>
-        <w:t>c) Thu nhập bình quân còn lại để trả gốc:</w:t>
-      </w:r>
-    </w:p>
-    <w:p>
-      <w:pPr>
-        <w:spacing w:after="0" w:line="276" w:lineRule="auto"/>
-        <w:ind w:firstLine="567"/>
-        <w:jc w:val="both"/>
-        <w:rPr>
-          <w:rFonts w:ascii="Times New Roman" w:hAnsi="Times New Roman" w:cs="Times New Roman"/>
-          <w:sz w:val="26"/>
-          <w:szCs w:val="26"/>
-        </w:rPr>
-      </w:pPr>
-      <w:r>
-        <w:rPr>
-          <w:rFonts w:ascii="Times New Roman" w:hAnsi="Times New Roman" w:cs="Times New Roman"/>
-          <w:sz w:val="26"/>
-          <w:szCs w:val="26"/>
-        </w:rPr>
-        <w:t>[PA.Tổng thu nhập kỳ] đồng - [PA.Tổng chi phí kỳ] đồng = [PA.Dư trả gốc] đồng.</w:t>
-      </w:r>
-    </w:p>
-    <w:p>
-      <w:pPr>
-        <w:spacing w:after="0" w:line="276" w:lineRule="auto"/>
-        <w:ind w:firstLine="567"/>
-        <w:jc w:val="both"/>
-        <w:rPr>
-          <w:rFonts w:ascii="Times New Roman" w:hAnsi="Times New Roman" w:cs="Times New Roman"/>
-          <w:sz w:val="26"/>
-          <w:szCs w:val="26"/>
-        </w:rPr>
-      </w:pPr>
-      <w:r>
-        <w:rPr>
-          <w:rFonts w:ascii="Times New Roman" w:hAnsi="Times New Roman" w:cs="Times New Roman"/>
-          <w:sz w:val="26"/>
-          <w:szCs w:val="26"/>
-        </w:rPr>
-        <w:t>d) Định kỳ trả nợ:</w:t>
-      </w:r>
-    </w:p>
-    <w:p>
-      <w:pPr>
-        <w:spacing w:after="0" w:line="276" w:lineRule="auto"/>
-        <w:ind w:firstLine="567"/>
-        <w:jc w:val="both"/>
-        <w:rPr>
-          <w:rFonts w:ascii="Times New Roman" w:hAnsi="Times New Roman" w:cs="Times New Roman"/>
-          <w:sz w:val="26"/>
-          <w:szCs w:val="26"/>
-        </w:rPr>
-      </w:pPr>
-      <w:r>
-        <w:rPr>
-          <w:rFonts w:ascii="Times New Roman" w:hAnsi="Times New Roman" w:cs="Times New Roman"/>
-          <w:sz w:val="26"/>
-          <w:szCs w:val="26"/>
-        </w:rPr>
-        <w:t>- Trả lãi vay: hàng tháng;</w:t>
-      </w:r>
-    </w:p>
-    <w:p>
-      <w:pPr>
-        <w:spacing w:after="0" w:line="276" w:lineRule="auto"/>
-        <w:ind w:firstLine="567"/>
-        <w:jc w:val="both"/>
-        <w:rPr>
-          <w:rFonts w:ascii="Times New Roman" w:hAnsi="Times New Roman" w:cs="Times New Roman"/>
-          <w:sz w:val="26"/>
-          <w:szCs w:val="26"/>
-        </w:rPr>
-      </w:pPr>
-      <w:r>
-        <w:rPr>
-          <w:rFonts w:ascii="Times New Roman" w:hAnsi="Times New Roman" w:cs="Times New Roman"/>
-          <w:sz w:val="26"/>
-          <w:szCs w:val="26"/>
-        </w:rPr>
-        <w:t xml:space="preserve">- Trả gốc: Khách hàng cam kết sử dụng nguồn thu nhập từ lương và phụ cấp của [PA.Mô tả người trả nợ] để trả nợ gốc cho khoản vay tại Agribank Lâm Đồng PGD Hòa Bình trong vòng [PA.Thời hạn vay text], trả gốc [PA.Kỳ hạn trả gốc text], mỗi kỳ trả </w:t>
-      </w:r>
-      <w:r>
-        <w:rPr>
-          <w:rFonts w:ascii="Times New Roman" w:hAnsi="Times New Roman" w:cs="Times New Roman"/>
-          <w:sz w:val="26"/>
-          <w:szCs w:val="26"/>
-        </w:rPr>
-        <w:lastRenderedPageBreak/>
-        <w:t>[PA.Số tiền trả gốc mỗi kỳ] đồng. Thu nhập còn lại khách hàng sử dụng để trang trải các chi phí phát sinh khác.</w:t>
-      </w:r>
-    </w:p>
-    <w:p>
-      <w:pPr>
-        <w:spacing w:after="0" w:line="276" w:lineRule="auto"/>
-        <w:ind w:firstLine="567"/>
-        <w:jc w:val="both"/>
-        <w:rPr>
-          <w:rFonts w:ascii="Times New Roman" w:hAnsi="Times New Roman" w:cs="Times New Roman"/>
-          <w:sz w:val="26"/>
-          <w:szCs w:val="26"/>
-        </w:rPr>
-      </w:pPr>
-      <w:r>
-        <w:rPr>
-          <w:rFonts w:ascii="Times New Roman" w:hAnsi="Times New Roman" w:cs="Times New Roman"/>
-          <w:sz w:val="26"/>
-          <w:szCs w:val="26"/>
-        </w:rPr>
-        <w:t>e) Thu nhập còn lại sau khi trả nợ:</w:t>
-      </w:r>
-    </w:p>
-    <w:p>
-      <w:pPr>
-        <w:spacing w:after="0" w:line="276" w:lineRule="auto"/>
-        <w:ind w:firstLine="567"/>
-        <w:jc w:val="both"/>
-        <w:rPr>
-          <w:rFonts w:ascii="Times New Roman" w:hAnsi="Times New Roman" w:cs="Times New Roman"/>
-          <w:sz w:val="26"/>
-          <w:szCs w:val="26"/>
-        </w:rPr>
-      </w:pPr>
-      <w:r>
-        <w:rPr>
-          <w:rFonts w:ascii="Times New Roman" w:hAnsi="Times New Roman" w:cs="Times New Roman"/>
-          <w:sz w:val="26"/>
-          <w:szCs w:val="26"/>
-        </w:rPr>
-        <w:t>[PA.Dư trả gốc] đồng – [PA.Số tiền trả gốc mỗi kỳ] đồng = [PA.Thu nhập còn lại] đồng.</w:t>
-      </w:r>
-    </w:p>
+          <w:lang w:val="fr-FR"/>
+        </w:rPr>
+        <w:t>Agribank [Tên chi nhánh/PGD]</w:t>
+      </w:r>
+      <w:r>
+        <w:rPr>
+          <w:rFonts w:ascii="Times New Roman" w:eastAsia="Times New Roman" w:hAnsi="Times New Roman" w:cs="Times New Roman"/>
+          <w:sz w:val="26"/>
+          <w:szCs w:val="28"/>
+          <w:lang w:val="de-DE"/>
+        </w:rPr>
+        <w:t xml:space="preserve"> trong vòng [PA.Thời hạn vay], trả gốc [PA.Kỳ hạn trả gốc]</w:t>
+      </w:r>
+      <w:r>
+        <w:rPr>
+          <w:rFonts w:ascii="Times New Roman" w:eastAsia="Times New Roman" w:hAnsi="Times New Roman" w:cs="Times New Roman"/>
+          <w:sz w:val="26"/>
+          <w:szCs w:val="28"/>
+          <w:lang w:val="de-DE"/>
+        </w:rPr>
+        <w:t xml:space="preserve"> 01 kỳ</w:t>
+      </w:r>
+      <w:r>
+        <w:rPr>
+          <w:rFonts w:ascii="Times New Roman" w:eastAsia="Times New Roman" w:hAnsi="Times New Roman" w:cs="Times New Roman"/>
+          <w:sz w:val="26"/>
+          <w:szCs w:val="28"/>
+          <w:lang w:val="de-DE"/>
+        </w:rPr>
+        <w:t>, mỗi kỳ trả [PA.Số tiền trả gốc mỗi kỳ] đồng. Kỳ trả gốc cuối cùng là [PA.Số tiền trả gốc kỳ cuối] đồng. Thu nhập còn lại khách hàng sử dụng để trang trải các chi phí phát sinh khác.</w:t>
+      </w:r>
+      <w:r>
+        <w:rPr>
+          <w:rFonts w:ascii="Times New Roman" w:eastAsia="Times New Roman" w:hAnsi="Times New Roman" w:cs="Times New Roman"/>
+          <w:sz w:val="26"/>
+          <w:szCs w:val="28"/>
+          <w:lang w:val="de-DE"/>
+        </w:rPr>
+        <w:t xml:space="preserve"> Cụ thể gốc lãi phải trả và thu nhập còn lại sau khi trả nợ như sau:</w:t>
+      </w:r>
+    </w:p>
+    <w:p>
+      <w:pPr>
+        <w:pStyle w:val="ListParagraph"/>
+        <w:spacing w:after="0" w:line="276" w:lineRule="auto"/>
+        <w:ind w:left="0" w:firstLine="567"/>
+        <w:contextualSpacing w:val="0"/>
+        <w:jc w:val="right"/>
+        <w:rPr>
+          <w:rFonts w:ascii="Times New Roman" w:eastAsia="Times New Roman" w:hAnsi="Times New Roman" w:cs="Times New Roman"/>
+          <w:sz w:val="26"/>
+          <w:szCs w:val="28"/>
+          <w:lang w:val="de-DE"/>
+        </w:rPr>
+      </w:pPr>
+      <w:r>
+        <w:rPr>
+          <w:rFonts w:ascii="Times New Roman" w:eastAsia="Times New Roman" w:hAnsi="Times New Roman" w:cs="Times New Roman"/>
+          <w:sz w:val="26"/>
+          <w:szCs w:val="28"/>
+          <w:lang w:val="de-DE"/>
+        </w:rPr>
+        <w:t>Đơn vị: đồng</w:t>
+      </w:r>
+    </w:p>
+    <w:tbl>
+      <w:tblPr>
+        <w:tblW w:w="0" w:type="auto"/>
+        <w:tblInd w:w="-176" w:type="dxa"/>
+        <w:tblLook w:val="04A0" w:firstRow="1" w:lastRow="0" w:firstColumn="1" w:lastColumn="0" w:noHBand="0" w:noVBand="1"/>
+      </w:tblPr>
+      <w:tblGrid>
+        <w:gridCol w:w="1750"/>
+        <w:gridCol w:w="2091"/>
+        <w:gridCol w:w="1457"/>
+        <w:gridCol w:w="1341"/>
+        <w:gridCol w:w="1458"/>
+        <w:gridCol w:w="1933"/>
+      </w:tblGrid>
+      <w:tr>
+        <w:trPr>
+          <w:trHeight w:val="401"/>
+        </w:trPr>
+        <w:tc>
+          <w:tcPr>
+            <w:tcW w:w="1560" w:type="dxa"/>
+            <w:tcBorders>
+              <w:top w:val="single" w:sz="4" w:space="0" w:color="auto"/>
+              <w:left w:val="single" w:sz="4" w:space="0" w:color="auto"/>
+              <w:bottom w:val="single" w:sz="4" w:space="0" w:color="auto"/>
+              <w:right w:val="single" w:sz="4" w:space="0" w:color="auto"/>
+            </w:tcBorders>
+            <w:shd w:val="clear" w:color="000000" w:fill="FFFFFF"/>
+            <w:vAlign w:val="center"/>
+            <w:hideMark/>
+          </w:tcPr>
+          <w:p>
+            <w:pPr>
+              <w:spacing w:after="0" w:line="240" w:lineRule="auto"/>
+              <w:jc w:val="center"/>
+              <w:rPr>
+                <w:rFonts w:ascii="Times New Roman" w:eastAsia="Times New Roman" w:hAnsi="Times New Roman" w:cs="Times New Roman"/>
+                <w:b/>
+                <w:bCs/>
+                <w:sz w:val="24"/>
+                <w:szCs w:val="24"/>
+              </w:rPr>
+            </w:pPr>
+            <w:r>
+              <w:rPr>
+                <w:rFonts w:ascii="Times New Roman" w:eastAsia="Times New Roman" w:hAnsi="Times New Roman" w:cs="Times New Roman"/>
+                <w:b/>
+                <w:bCs/>
+                <w:sz w:val="24"/>
+                <w:szCs w:val="24"/>
+              </w:rPr>
+              <w:t>Năm</w:t>
+            </w:r>
+          </w:p>
+        </w:tc>
+        <w:tc>
+          <w:tcPr>
+            <w:tcW w:w="2143" w:type="dxa"/>
+            <w:tcBorders>
+              <w:top w:val="single" w:sz="4" w:space="0" w:color="auto"/>
+              <w:left w:val="nil"/>
+              <w:bottom w:val="single" w:sz="4" w:space="0" w:color="auto"/>
+              <w:right w:val="single" w:sz="4" w:space="0" w:color="auto"/>
+            </w:tcBorders>
+            <w:shd w:val="clear" w:color="000000" w:fill="FFFFFF"/>
+            <w:vAlign w:val="center"/>
+            <w:hideMark/>
+          </w:tcPr>
+          <w:p>
+            <w:pPr>
+              <w:spacing w:after="0" w:line="240" w:lineRule="auto"/>
+              <w:jc w:val="center"/>
+              <w:rPr>
+                <w:rFonts w:ascii="Times New Roman" w:eastAsia="Times New Roman" w:hAnsi="Times New Roman" w:cs="Times New Roman"/>
+                <w:b/>
+                <w:bCs/>
+                <w:sz w:val="24"/>
+                <w:szCs w:val="24"/>
+              </w:rPr>
+            </w:pPr>
+            <w:r>
+              <w:rPr>
+                <w:rFonts w:ascii="Times New Roman" w:eastAsia="Times New Roman" w:hAnsi="Times New Roman" w:cs="Times New Roman"/>
+                <w:b/>
+                <w:bCs/>
+                <w:sz w:val="24"/>
+                <w:szCs w:val="24"/>
+              </w:rPr>
+              <w:t>Thu nhập trả nợ</w:t>
+            </w:r>
+          </w:p>
+        </w:tc>
+        <w:tc>
+          <w:tcPr>
+            <w:tcW w:w="1489" w:type="dxa"/>
+            <w:tcBorders>
+              <w:top w:val="single" w:sz="4" w:space="0" w:color="auto"/>
+              <w:left w:val="nil"/>
+              <w:bottom w:val="single" w:sz="4" w:space="0" w:color="auto"/>
+              <w:right w:val="single" w:sz="4" w:space="0" w:color="auto"/>
+            </w:tcBorders>
+            <w:shd w:val="clear" w:color="000000" w:fill="FFFFFF"/>
+            <w:vAlign w:val="center"/>
+            <w:hideMark/>
+          </w:tcPr>
+          <w:p>
+            <w:pPr>
+              <w:spacing w:after="0" w:line="240" w:lineRule="auto"/>
+              <w:jc w:val="center"/>
+              <w:rPr>
+                <w:rFonts w:ascii="Times New Roman" w:eastAsia="Times New Roman" w:hAnsi="Times New Roman" w:cs="Times New Roman"/>
+                <w:b/>
+                <w:bCs/>
+                <w:sz w:val="24"/>
+                <w:szCs w:val="24"/>
+              </w:rPr>
+            </w:pPr>
+            <w:r>
+              <w:rPr>
+                <w:rFonts w:ascii="Times New Roman" w:eastAsia="Times New Roman" w:hAnsi="Times New Roman" w:cs="Times New Roman"/>
+                <w:b/>
+                <w:bCs/>
+                <w:sz w:val="24"/>
+                <w:szCs w:val="24"/>
+              </w:rPr>
+              <w:t>Dư nợ</w:t>
+            </w:r>
+          </w:p>
+        </w:tc>
+        <w:tc>
+          <w:tcPr>
+            <w:tcW w:w="1365" w:type="dxa"/>
+            <w:tcBorders>
+              <w:top w:val="single" w:sz="4" w:space="0" w:color="auto"/>
+              <w:left w:val="nil"/>
+              <w:bottom w:val="single" w:sz="4" w:space="0" w:color="auto"/>
+              <w:right w:val="single" w:sz="4" w:space="0" w:color="auto"/>
+            </w:tcBorders>
+            <w:shd w:val="clear" w:color="000000" w:fill="FFFFFF"/>
+            <w:vAlign w:val="center"/>
+            <w:hideMark/>
+          </w:tcPr>
+          <w:p>
+            <w:pPr>
+              <w:spacing w:after="0" w:line="240" w:lineRule="auto"/>
+              <w:jc w:val="center"/>
+              <w:rPr>
+                <w:rFonts w:ascii="Times New Roman" w:eastAsia="Times New Roman" w:hAnsi="Times New Roman" w:cs="Times New Roman"/>
+                <w:b/>
+                <w:bCs/>
+                <w:sz w:val="24"/>
+                <w:szCs w:val="24"/>
+              </w:rPr>
+            </w:pPr>
+            <w:r>
+              <w:rPr>
+                <w:rFonts w:ascii="Times New Roman" w:eastAsia="Times New Roman" w:hAnsi="Times New Roman" w:cs="Times New Roman"/>
+                <w:b/>
+                <w:bCs/>
+                <w:sz w:val="24"/>
+                <w:szCs w:val="24"/>
+              </w:rPr>
+              <w:t>Gốc trả</w:t>
+            </w:r>
+          </w:p>
+        </w:tc>
+        <w:tc>
+          <w:tcPr>
+            <w:tcW w:w="1490" w:type="dxa"/>
+            <w:tcBorders>
+              <w:top w:val="single" w:sz="4" w:space="0" w:color="auto"/>
+              <w:left w:val="nil"/>
+              <w:bottom w:val="single" w:sz="4" w:space="0" w:color="auto"/>
+              <w:right w:val="single" w:sz="4" w:space="0" w:color="auto"/>
+            </w:tcBorders>
+            <w:shd w:val="clear" w:color="000000" w:fill="FFFFFF"/>
+            <w:vAlign w:val="center"/>
+            <w:hideMark/>
+          </w:tcPr>
+          <w:p>
+            <w:pPr>
+              <w:spacing w:after="0" w:line="240" w:lineRule="auto"/>
+              <w:jc w:val="center"/>
+              <w:rPr>
+                <w:rFonts w:ascii="Times New Roman" w:eastAsia="Times New Roman" w:hAnsi="Times New Roman" w:cs="Times New Roman"/>
+                <w:b/>
+                <w:bCs/>
+                <w:sz w:val="24"/>
+                <w:szCs w:val="24"/>
+              </w:rPr>
+            </w:pPr>
+            <w:r>
+              <w:rPr>
+                <w:rFonts w:ascii="Times New Roman" w:eastAsia="Times New Roman" w:hAnsi="Times New Roman" w:cs="Times New Roman"/>
+                <w:b/>
+                <w:bCs/>
+                <w:sz w:val="24"/>
+                <w:szCs w:val="24"/>
+              </w:rPr>
+              <w:t>Lãi trả</w:t>
+            </w:r>
+          </w:p>
+        </w:tc>
+        <w:tc>
+          <w:tcPr>
+            <w:tcW w:w="1983" w:type="dxa"/>
+            <w:tcBorders>
+              <w:top w:val="single" w:sz="4" w:space="0" w:color="auto"/>
+              <w:left w:val="nil"/>
+              <w:bottom w:val="single" w:sz="4" w:space="0" w:color="auto"/>
+              <w:right w:val="single" w:sz="4" w:space="0" w:color="auto"/>
+            </w:tcBorders>
+            <w:shd w:val="clear" w:color="000000" w:fill="FFFFFF"/>
+            <w:vAlign w:val="center"/>
+            <w:hideMark/>
+          </w:tcPr>
+          <w:p>
+            <w:pPr>
+              <w:spacing w:after="0" w:line="240" w:lineRule="auto"/>
+              <w:jc w:val="center"/>
+              <w:rPr>
+                <w:rFonts w:ascii="Times New Roman" w:eastAsia="Times New Roman" w:hAnsi="Times New Roman" w:cs="Times New Roman"/>
+                <w:b/>
+                <w:bCs/>
+                <w:sz w:val="24"/>
+                <w:szCs w:val="24"/>
+              </w:rPr>
+            </w:pPr>
+            <w:r>
+              <w:rPr>
+                <w:rFonts w:ascii="Times New Roman" w:eastAsia="Times New Roman" w:hAnsi="Times New Roman" w:cs="Times New Roman"/>
+                <w:b/>
+                <w:bCs/>
+                <w:sz w:val="24"/>
+                <w:szCs w:val="24"/>
+              </w:rPr>
+              <w:t>TN còn lại</w:t>
+            </w:r>
+          </w:p>
+        </w:tc>
+      </w:tr>
+      <w:tr>
+        <w:trPr>
+          <w:trHeight w:val="391"/>
+        </w:trPr>
+        <w:tc>
+          <w:tcPr>
+            <w:tcW w:w="1560" w:type="dxa"/>
+            <w:tcBorders>
+              <w:top w:val="nil"/>
+              <w:left w:val="single" w:sz="4" w:space="0" w:color="auto"/>
+              <w:bottom w:val="single" w:sz="4" w:space="0" w:color="auto"/>
+              <w:right w:val="single" w:sz="4" w:space="0" w:color="auto"/>
+            </w:tcBorders>
+            <w:shd w:val="clear" w:color="000000" w:fill="FFFFFF"/>
+            <w:vAlign w:val="center"/>
+          </w:tcPr>
+          <w:p>
+            <w:pPr>
+              <w:spacing w:after="0" w:line="240" w:lineRule="auto"/>
+              <w:jc w:val="center"/>
+              <w:rPr>
+                <w:rFonts w:ascii="Times New Roman" w:eastAsia="Times New Roman" w:hAnsi="Times New Roman" w:cs="Times New Roman"/>
+                <w:sz w:val="24"/>
+                <w:szCs w:val="24"/>
+              </w:rPr>
+            </w:pPr>
+            <w:r>
+              <w:rPr>
+                <w:rFonts w:ascii="Times New Roman" w:eastAsia="Times New Roman" w:hAnsi="Times New Roman" w:cs="Times New Roman"/>
+                <w:sz w:val="24"/>
+                <w:szCs w:val="24"/>
+              </w:rPr>
+              <w:t>[#PA_TRANO]</w:t>
+            </w:r>
+          </w:p>
+        </w:tc>
+        <w:tc>
+          <w:tcPr>
+            <w:tcW w:w="2143" w:type="dxa"/>
+            <w:tcBorders>
+              <w:top w:val="nil"/>
+              <w:left w:val="nil"/>
+              <w:bottom w:val="single" w:sz="4" w:space="0" w:color="auto"/>
+              <w:right w:val="single" w:sz="4" w:space="0" w:color="auto"/>
+            </w:tcBorders>
+            <w:shd w:val="clear" w:color="000000" w:fill="FFFFFF"/>
+            <w:vAlign w:val="center"/>
+          </w:tcPr>
+          <w:p>
+            <w:pPr>
+              <w:spacing w:after="0" w:line="240" w:lineRule="auto"/>
+              <w:jc w:val="right"/>
+              <w:rPr>
+                <w:rFonts w:ascii="Times New Roman" w:eastAsia="Times New Roman" w:hAnsi="Times New Roman" w:cs="Times New Roman"/>
+                <w:sz w:val="24"/>
+                <w:szCs w:val="24"/>
+              </w:rPr>
+            </w:pPr>
+          </w:p>
+        </w:tc>
+        <w:tc>
+          <w:tcPr>
+            <w:tcW w:w="1489" w:type="dxa"/>
+            <w:tcBorders>
+              <w:top w:val="nil"/>
+              <w:left w:val="nil"/>
+              <w:bottom w:val="single" w:sz="4" w:space="0" w:color="auto"/>
+              <w:right w:val="single" w:sz="4" w:space="0" w:color="auto"/>
+            </w:tcBorders>
+            <w:shd w:val="clear" w:color="000000" w:fill="FFFFFF"/>
+            <w:vAlign w:val="center"/>
+          </w:tcPr>
+          <w:p>
+            <w:pPr>
+              <w:spacing w:after="0" w:line="240" w:lineRule="auto"/>
+              <w:jc w:val="right"/>
+              <w:rPr>
+                <w:rFonts w:ascii="Times New Roman" w:eastAsia="Times New Roman" w:hAnsi="Times New Roman" w:cs="Times New Roman"/>
+                <w:sz w:val="24"/>
+                <w:szCs w:val="24"/>
+              </w:rPr>
+            </w:pPr>
+          </w:p>
+        </w:tc>
+        <w:tc>
+          <w:tcPr>
+            <w:tcW w:w="1365" w:type="dxa"/>
+            <w:tcBorders>
+              <w:top w:val="nil"/>
+              <w:left w:val="nil"/>
+              <w:bottom w:val="single" w:sz="4" w:space="0" w:color="auto"/>
+              <w:right w:val="single" w:sz="4" w:space="0" w:color="auto"/>
+            </w:tcBorders>
+            <w:shd w:val="clear" w:color="000000" w:fill="FFFFFF"/>
+            <w:vAlign w:val="center"/>
+          </w:tcPr>
+          <w:p>
+            <w:pPr>
+              <w:spacing w:after="0" w:line="240" w:lineRule="auto"/>
+              <w:jc w:val="right"/>
+              <w:rPr>
+                <w:rFonts w:ascii="Times New Roman" w:eastAsia="Times New Roman" w:hAnsi="Times New Roman" w:cs="Times New Roman"/>
+                <w:sz w:val="24"/>
+                <w:szCs w:val="24"/>
+              </w:rPr>
+            </w:pPr>
+          </w:p>
+        </w:tc>
+        <w:tc>
+          <w:tcPr>
+            <w:tcW w:w="1490" w:type="dxa"/>
+            <w:tcBorders>
+              <w:top w:val="nil"/>
+              <w:left w:val="nil"/>
+              <w:bottom w:val="single" w:sz="4" w:space="0" w:color="auto"/>
+              <w:right w:val="single" w:sz="4" w:space="0" w:color="auto"/>
+            </w:tcBorders>
+            <w:shd w:val="clear" w:color="000000" w:fill="FFFFFF"/>
+            <w:vAlign w:val="center"/>
+          </w:tcPr>
+          <w:p>
+            <w:pPr>
+              <w:spacing w:after="0" w:line="240" w:lineRule="auto"/>
+              <w:jc w:val="right"/>
+              <w:rPr>
+                <w:rFonts w:ascii="Times New Roman" w:eastAsia="Times New Roman" w:hAnsi="Times New Roman" w:cs="Times New Roman"/>
+                <w:sz w:val="24"/>
+                <w:szCs w:val="24"/>
+              </w:rPr>
+            </w:pPr>
+          </w:p>
+        </w:tc>
+        <w:tc>
+          <w:tcPr>
+            <w:tcW w:w="1983" w:type="dxa"/>
+            <w:tcBorders>
+              <w:top w:val="nil"/>
+              <w:left w:val="nil"/>
+              <w:bottom w:val="single" w:sz="4" w:space="0" w:color="auto"/>
+              <w:right w:val="single" w:sz="4" w:space="0" w:color="auto"/>
+            </w:tcBorders>
+            <w:shd w:val="clear" w:color="000000" w:fill="FFFFFF"/>
+            <w:vAlign w:val="center"/>
+          </w:tcPr>
+          <w:p>
+            <w:pPr>
+              <w:spacing w:after="0" w:line="240" w:lineRule="auto"/>
+              <w:jc w:val="right"/>
+              <w:rPr>
+                <w:rFonts w:ascii="Times New Roman" w:eastAsia="Times New Roman" w:hAnsi="Times New Roman" w:cs="Times New Roman"/>
+                <w:sz w:val="24"/>
+                <w:szCs w:val="24"/>
+              </w:rPr>
+            </w:pPr>
+          </w:p>
+        </w:tc>
+      </w:tr>
+      <w:tr>
+        <w:trPr>
+          <w:trHeight w:val="411"/>
+        </w:trPr>
+        <w:tc>
+          <w:tcPr>
+            <w:tcW w:w="1560" w:type="dxa"/>
+            <w:tcBorders>
+              <w:top w:val="single" w:sz="4" w:space="0" w:color="auto"/>
+              <w:left w:val="single" w:sz="4" w:space="0" w:color="auto"/>
+              <w:bottom w:val="single" w:sz="4" w:space="0" w:color="auto"/>
+              <w:right w:val="single" w:sz="4" w:space="0" w:color="auto"/>
+            </w:tcBorders>
+            <w:shd w:val="clear" w:color="000000" w:fill="FFFFFF"/>
+            <w:vAlign w:val="center"/>
+            <w:hideMark/>
+          </w:tcPr>
+          <w:p>
+            <w:pPr>
+              <w:spacing w:after="0" w:line="240" w:lineRule="auto"/>
+              <w:jc w:val="center"/>
+              <w:rPr>
+                <w:rFonts w:ascii="Times New Roman" w:eastAsia="Times New Roman" w:hAnsi="Times New Roman" w:cs="Times New Roman"/>
+                <w:sz w:val="24"/>
+                <w:szCs w:val="24"/>
+              </w:rPr>
+            </w:pPr>
+            <w:r>
+              <w:rPr>
+                <w:rFonts w:ascii="Times New Roman" w:eastAsia="Times New Roman" w:hAnsi="Times New Roman" w:cs="Times New Roman"/>
+                <w:sz w:val="24"/>
+                <w:szCs w:val="24"/>
+              </w:rPr>
+              <w:t>[Năm]</w:t>
+            </w:r>
+          </w:p>
+        </w:tc>
+        <w:tc>
+          <w:tcPr>
+            <w:tcW w:w="2143" w:type="dxa"/>
+            <w:tcBorders>
+              <w:top w:val="single" w:sz="4" w:space="0" w:color="auto"/>
+              <w:left w:val="nil"/>
+              <w:bottom w:val="single" w:sz="4" w:space="0" w:color="auto"/>
+              <w:right w:val="single" w:sz="4" w:space="0" w:color="auto"/>
+            </w:tcBorders>
+            <w:shd w:val="clear" w:color="000000" w:fill="FFFFFF"/>
+            <w:vAlign w:val="center"/>
+            <w:hideMark/>
+          </w:tcPr>
+          <w:p>
+            <w:pPr>
+              <w:spacing w:after="0" w:line="240" w:lineRule="auto"/>
+              <w:jc w:val="right"/>
+              <w:rPr>
+                <w:rFonts w:ascii="Times New Roman" w:eastAsia="Times New Roman" w:hAnsi="Times New Roman" w:cs="Times New Roman"/>
+                <w:sz w:val="24"/>
+                <w:szCs w:val="24"/>
+              </w:rPr>
+            </w:pPr>
+            <w:r>
+              <w:rPr>
+                <w:rFonts w:ascii="Times New Roman" w:eastAsia="Times New Roman" w:hAnsi="Times New Roman" w:cs="Times New Roman"/>
+                <w:sz w:val="24"/>
+                <w:szCs w:val="24"/>
+              </w:rPr>
+              <w:t>[Thu nhập trả nợ]</w:t>
+            </w:r>
+          </w:p>
+        </w:tc>
+        <w:tc>
+          <w:tcPr>
+            <w:tcW w:w="1489" w:type="dxa"/>
+            <w:tcBorders>
+              <w:top w:val="single" w:sz="4" w:space="0" w:color="auto"/>
+              <w:left w:val="nil"/>
+              <w:bottom w:val="single" w:sz="4" w:space="0" w:color="auto"/>
+              <w:right w:val="single" w:sz="4" w:space="0" w:color="auto"/>
+            </w:tcBorders>
+            <w:shd w:val="clear" w:color="000000" w:fill="FFFFFF"/>
+            <w:vAlign w:val="center"/>
+            <w:hideMark/>
+          </w:tcPr>
+          <w:p>
+            <w:pPr>
+              <w:spacing w:after="0" w:line="240" w:lineRule="auto"/>
+              <w:jc w:val="right"/>
+              <w:rPr>
+                <w:rFonts w:ascii="Times New Roman" w:eastAsia="Times New Roman" w:hAnsi="Times New Roman" w:cs="Times New Roman"/>
+                <w:sz w:val="24"/>
+                <w:szCs w:val="24"/>
+              </w:rPr>
+            </w:pPr>
+            <w:r>
+              <w:rPr>
+                <w:rFonts w:ascii="Times New Roman" w:eastAsia="Times New Roman" w:hAnsi="Times New Roman" w:cs="Times New Roman"/>
+                <w:sz w:val="24"/>
+                <w:szCs w:val="24"/>
+              </w:rPr>
+              <w:t>[Dư nợ]</w:t>
+            </w:r>
+          </w:p>
+        </w:tc>
+        <w:tc>
+          <w:tcPr>
+            <w:tcW w:w="1365" w:type="dxa"/>
+            <w:tcBorders>
+              <w:top w:val="single" w:sz="4" w:space="0" w:color="auto"/>
+              <w:left w:val="nil"/>
+              <w:bottom w:val="single" w:sz="4" w:space="0" w:color="auto"/>
+              <w:right w:val="single" w:sz="4" w:space="0" w:color="auto"/>
+            </w:tcBorders>
+            <w:shd w:val="clear" w:color="000000" w:fill="FFFFFF"/>
+            <w:vAlign w:val="center"/>
+            <w:hideMark/>
+          </w:tcPr>
+          <w:p>
+            <w:pPr>
+              <w:spacing w:after="0" w:line="240" w:lineRule="auto"/>
+              <w:jc w:val="right"/>
+              <w:rPr>
+                <w:rFonts w:ascii="Times New Roman" w:eastAsia="Times New Roman" w:hAnsi="Times New Roman" w:cs="Times New Roman"/>
+                <w:sz w:val="24"/>
+                <w:szCs w:val="24"/>
+              </w:rPr>
+            </w:pPr>
+            <w:r>
+              <w:rPr>
+                <w:rFonts w:ascii="Times New Roman" w:eastAsia="Times New Roman" w:hAnsi="Times New Roman" w:cs="Times New Roman"/>
+                <w:sz w:val="24"/>
+                <w:szCs w:val="24"/>
+              </w:rPr>
+              <w:t>[Gốc trả]</w:t>
+            </w:r>
+          </w:p>
+        </w:tc>
+        <w:tc>
+          <w:tcPr>
+            <w:tcW w:w="1490" w:type="dxa"/>
+            <w:tcBorders>
+              <w:top w:val="single" w:sz="4" w:space="0" w:color="auto"/>
+              <w:left w:val="nil"/>
+              <w:bottom w:val="single" w:sz="4" w:space="0" w:color="auto"/>
+              <w:right w:val="single" w:sz="4" w:space="0" w:color="auto"/>
+            </w:tcBorders>
+            <w:shd w:val="clear" w:color="000000" w:fill="FFFFFF"/>
+            <w:vAlign w:val="center"/>
+            <w:hideMark/>
+          </w:tcPr>
+          <w:p>
+            <w:pPr>
+              <w:spacing w:after="0" w:line="240" w:lineRule="auto"/>
+              <w:jc w:val="right"/>
+              <w:rPr>
+                <w:rFonts w:ascii="Times New Roman" w:eastAsia="Times New Roman" w:hAnsi="Times New Roman" w:cs="Times New Roman"/>
+                <w:sz w:val="24"/>
+                <w:szCs w:val="24"/>
+              </w:rPr>
+            </w:pPr>
+            <w:r>
+              <w:rPr>
+                <w:rFonts w:ascii="Times New Roman" w:eastAsia="Times New Roman" w:hAnsi="Times New Roman" w:cs="Times New Roman"/>
+                <w:sz w:val="24"/>
+                <w:szCs w:val="24"/>
+              </w:rPr>
+              <w:t>[Lãi trả]</w:t>
+            </w:r>
+          </w:p>
+        </w:tc>
+        <w:tc>
+          <w:tcPr>
+            <w:tcW w:w="1983" w:type="dxa"/>
+            <w:tcBorders>
+              <w:top w:val="single" w:sz="4" w:space="0" w:color="auto"/>
+              <w:left w:val="nil"/>
+              <w:bottom w:val="single" w:sz="4" w:space="0" w:color="auto"/>
+              <w:right w:val="single" w:sz="4" w:space="0" w:color="auto"/>
+            </w:tcBorders>
+            <w:shd w:val="clear" w:color="000000" w:fill="FFFFFF"/>
+            <w:vAlign w:val="center"/>
+            <w:hideMark/>
+          </w:tcPr>
+          <w:p>
+            <w:pPr>
+              <w:spacing w:after="0" w:line="240" w:lineRule="auto"/>
+              <w:jc w:val="right"/>
+              <w:rPr>
+                <w:rFonts w:ascii="Times New Roman" w:eastAsia="Times New Roman" w:hAnsi="Times New Roman" w:cs="Times New Roman"/>
+                <w:sz w:val="24"/>
+                <w:szCs w:val="24"/>
+              </w:rPr>
+            </w:pPr>
+            <w:r>
+              <w:rPr>
+                <w:rFonts w:ascii="Times New Roman" w:eastAsia="Times New Roman" w:hAnsi="Times New Roman" w:cs="Times New Roman"/>
+                <w:sz w:val="24"/>
+                <w:szCs w:val="24"/>
+              </w:rPr>
+              <w:t>[TN còn lại]</w:t>
+            </w:r>
+          </w:p>
+        </w:tc>
+      </w:tr>
+      <w:tr>
+        <w:trPr>
+          <w:trHeight w:val="419"/>
+        </w:trPr>
+        <w:tc>
+          <w:tcPr>
+            <w:tcW w:w="1560" w:type="dxa"/>
+            <w:tcBorders>
+              <w:top w:val="single" w:sz="4" w:space="0" w:color="auto"/>
+              <w:left w:val="single" w:sz="4" w:space="0" w:color="auto"/>
+              <w:bottom w:val="single" w:sz="4" w:space="0" w:color="auto"/>
+              <w:right w:val="single" w:sz="4" w:space="0" w:color="auto"/>
+            </w:tcBorders>
+            <w:shd w:val="clear" w:color="000000" w:fill="FFFFFF"/>
+            <w:vAlign w:val="center"/>
+          </w:tcPr>
+          <w:p>
+            <w:pPr>
+              <w:spacing w:after="0" w:line="240" w:lineRule="auto"/>
+              <w:jc w:val="center"/>
+              <w:rPr>
+                <w:rFonts w:ascii="Times New Roman" w:eastAsia="Times New Roman" w:hAnsi="Times New Roman" w:cs="Times New Roman"/>
+                <w:sz w:val="24"/>
+                <w:szCs w:val="24"/>
+              </w:rPr>
+            </w:pPr>
+            <w:r>
+              <w:rPr>
+                <w:rFonts w:ascii="Times New Roman" w:eastAsia="Times New Roman" w:hAnsi="Times New Roman" w:cs="Times New Roman"/>
+                <w:sz w:val="24"/>
+                <w:szCs w:val="24"/>
+              </w:rPr>
+              <w:t>[/PA_TRANO]</w:t>
+            </w:r>
+          </w:p>
+        </w:tc>
+        <w:tc>
+          <w:tcPr>
+            <w:tcW w:w="2143" w:type="dxa"/>
+            <w:tcBorders>
+              <w:top w:val="single" w:sz="4" w:space="0" w:color="auto"/>
+              <w:left w:val="nil"/>
+              <w:bottom w:val="single" w:sz="4" w:space="0" w:color="auto"/>
+              <w:right w:val="single" w:sz="4" w:space="0" w:color="auto"/>
+            </w:tcBorders>
+            <w:shd w:val="clear" w:color="000000" w:fill="FFFFFF"/>
+            <w:vAlign w:val="center"/>
+          </w:tcPr>
+          <w:p>
+            <w:pPr>
+              <w:spacing w:after="0" w:line="240" w:lineRule="auto"/>
+              <w:jc w:val="right"/>
+              <w:rPr>
+                <w:rFonts w:ascii="Times New Roman" w:eastAsia="Times New Roman" w:hAnsi="Times New Roman" w:cs="Times New Roman"/>
+                <w:sz w:val="24"/>
+                <w:szCs w:val="24"/>
+              </w:rPr>
+            </w:pPr>
+          </w:p>
+        </w:tc>
+        <w:tc>
+          <w:tcPr>
+            <w:tcW w:w="1489" w:type="dxa"/>
+            <w:tcBorders>
+              <w:top w:val="single" w:sz="4" w:space="0" w:color="auto"/>
+              <w:left w:val="nil"/>
+              <w:bottom w:val="single" w:sz="4" w:space="0" w:color="auto"/>
+              <w:right w:val="single" w:sz="4" w:space="0" w:color="auto"/>
+            </w:tcBorders>
+            <w:shd w:val="clear" w:color="000000" w:fill="FFFFFF"/>
+            <w:vAlign w:val="center"/>
+          </w:tcPr>
+          <w:p>
+            <w:pPr>
+              <w:spacing w:after="0" w:line="240" w:lineRule="auto"/>
+              <w:jc w:val="right"/>
+              <w:rPr>
+                <w:rFonts w:ascii="Times New Roman" w:eastAsia="Times New Roman" w:hAnsi="Times New Roman" w:cs="Times New Roman"/>
+                <w:sz w:val="24"/>
+                <w:szCs w:val="24"/>
+              </w:rPr>
+            </w:pPr>
+          </w:p>
+        </w:tc>
+        <w:tc>
+          <w:tcPr>
+            <w:tcW w:w="1365" w:type="dxa"/>
+            <w:tcBorders>
+              <w:top w:val="single" w:sz="4" w:space="0" w:color="auto"/>
+              <w:left w:val="nil"/>
+              <w:bottom w:val="single" w:sz="4" w:space="0" w:color="auto"/>
+              <w:right w:val="single" w:sz="4" w:space="0" w:color="auto"/>
+            </w:tcBorders>
+            <w:shd w:val="clear" w:color="000000" w:fill="FFFFFF"/>
+            <w:vAlign w:val="center"/>
+          </w:tcPr>
+          <w:p>
+            <w:pPr>
+              <w:spacing w:after="0" w:line="240" w:lineRule="auto"/>
+              <w:jc w:val="right"/>
+              <w:rPr>
+                <w:rFonts w:ascii="Times New Roman" w:eastAsia="Times New Roman" w:hAnsi="Times New Roman" w:cs="Times New Roman"/>
+                <w:sz w:val="24"/>
+                <w:szCs w:val="24"/>
+              </w:rPr>
+            </w:pPr>
+          </w:p>
+        </w:tc>
+        <w:tc>
+          <w:tcPr>
+            <w:tcW w:w="1490" w:type="dxa"/>
+            <w:tcBorders>
+              <w:top w:val="single" w:sz="4" w:space="0" w:color="auto"/>
+              <w:left w:val="nil"/>
+              <w:bottom w:val="single" w:sz="4" w:space="0" w:color="auto"/>
+              <w:right w:val="single" w:sz="4" w:space="0" w:color="auto"/>
+            </w:tcBorders>
+            <w:shd w:val="clear" w:color="000000" w:fill="FFFFFF"/>
+            <w:vAlign w:val="center"/>
+          </w:tcPr>
+          <w:p>
+            <w:pPr>
+              <w:spacing w:after="0" w:line="240" w:lineRule="auto"/>
+              <w:jc w:val="right"/>
+              <w:rPr>
+                <w:rFonts w:ascii="Times New Roman" w:eastAsia="Times New Roman" w:hAnsi="Times New Roman" w:cs="Times New Roman"/>
+                <w:sz w:val="24"/>
+                <w:szCs w:val="24"/>
+              </w:rPr>
+            </w:pPr>
+          </w:p>
+        </w:tc>
+        <w:tc>
+          <w:tcPr>
+            <w:tcW w:w="1983" w:type="dxa"/>
+            <w:tcBorders>
+              <w:top w:val="single" w:sz="4" w:space="0" w:color="auto"/>
+              <w:left w:val="nil"/>
+              <w:bottom w:val="single" w:sz="4" w:space="0" w:color="auto"/>
+              <w:right w:val="single" w:sz="4" w:space="0" w:color="auto"/>
+            </w:tcBorders>
+            <w:shd w:val="clear" w:color="000000" w:fill="FFFFFF"/>
+            <w:vAlign w:val="center"/>
+          </w:tcPr>
+          <w:p>
+            <w:pPr>
+              <w:spacing w:after="0" w:line="240" w:lineRule="auto"/>
+              <w:jc w:val="right"/>
+              <w:rPr>
+                <w:rFonts w:ascii="Times New Roman" w:eastAsia="Times New Roman" w:hAnsi="Times New Roman" w:cs="Times New Roman"/>
+                <w:sz w:val="24"/>
+                <w:szCs w:val="24"/>
+              </w:rPr>
+            </w:pPr>
+          </w:p>
+        </w:tc>
+      </w:tr>
+    </w:tbl>
     <w:p>
       <w:pPr>
         <w:pStyle w:val="ListParagraph"/>
@@ -10645,6 +12477,7 @@
           <w:sz w:val="26"/>
           <w:szCs w:val="28"/>
         </w:rPr>
+        <w:lastRenderedPageBreak/>
         <w:t>- Giá trị định giá tài sản bảo đảm</w:t>
       </w:r>
       <w:r>
@@ -11080,7 +12913,6 @@
           <w:szCs w:val="28"/>
           <w:lang w:val="pt-BR"/>
         </w:rPr>
-        <w:lastRenderedPageBreak/>
         <w:t>- Phương thức cho vay: Từng lần</w:t>
       </w:r>
       <w:r>
@@ -11763,6 +13595,7 @@
           <w:szCs w:val="28"/>
           <w:lang w:val="pt-BR"/>
         </w:rPr>
+        <w:lastRenderedPageBreak/>
         <w:t>Căn cứ hồ sơ vay vốn, đề xuất của Người quan hệ</w:t>
       </w:r>
       <w:r>
@@ -12121,7 +13954,6 @@
           <w:szCs w:val="28"/>
           <w:lang w:val="pt-BR"/>
         </w:rPr>
-        <w:lastRenderedPageBreak/>
         <w:t>+</w:t>
       </w:r>
       <w:r>

</xml_diff>